<commit_message>
update docs on Thu, Sep 24, 2026  07:46:41 AM
</commit_message>
<xml_diff>
--- a/Java/experience_v2.docx
+++ b/Java/experience_v2.docx
@@ -314,69 +314,109 @@
           <w:b/>
           <w:bCs/>
         </w:rPr>
-        <w:t>Projector (or Updator) Lambda</w:t>
-      </w:r>
+        <w:t xml:space="preserve">Projector (or </w:t>
+      </w:r>
+      <w:proofErr w:type="spellStart"/>
       <w:r>
         <w:rPr>
           <w:b/>
           <w:bCs/>
         </w:rPr>
-        <w:t>.</w:t>
-      </w:r>
-    </w:p>
-    <w:p/>
-    <w:p>
-      <w:pPr>
+        <w:t>Updator</w:t>
+      </w:r>
+      <w:proofErr w:type="spellEnd"/>
+      <w:r>
         <w:rPr>
           <w:b/>
           <w:bCs/>
         </w:rPr>
-      </w:pPr>
-      <w:r>
-        <w:t xml:space="preserve">A </w:t>
+        <w:t>) Lambda</w:t>
       </w:r>
       <w:r>
         <w:rPr>
           <w:b/>
           <w:bCs/>
         </w:rPr>
-        <w:t>Transactional Outbox Table</w:t>
-      </w:r>
-      <w:r>
+        <w:t>.</w:t>
+      </w:r>
+    </w:p>
+    <w:p/>
+    <w:p>
+      <w:pPr>
         <w:rPr>
           <w:b/>
           <w:bCs/>
         </w:rPr>
-        <w:t xml:space="preserve"> (event data)</w:t>
+      </w:pPr>
+      <w:r>
+        <w:t xml:space="preserve">A </w:t>
       </w:r>
       <w:r>
         <w:rPr>
           <w:b/>
           <w:bCs/>
         </w:rPr>
-        <w:t xml:space="preserve"> </w:t>
-      </w:r>
-      <w:r>
-        <w:t xml:space="preserve">ensures that if the schedule is successfully committed to PostgreSQL, the corresponding event </w:t>
-      </w:r>
-      <w:r>
-        <w:t>also persisted</w:t>
-      </w:r>
-      <w:r>
-        <w:t xml:space="preserve"> and can later be published to Kafka via Debezium CDC, preventing lost or inconsistent events.</w:t>
-      </w:r>
-    </w:p>
-    <w:p/>
-    <w:p>
-      <w:r>
-        <w:t xml:space="preserve">A </w:t>
+        <w:t>Transactional Outbox Table</w:t>
       </w:r>
       <w:r>
         <w:rPr>
           <w:b/>
           <w:bCs/>
         </w:rPr>
-        <w:t>Projector (or Updator) Lambda</w:t>
+        <w:t xml:space="preserve"> (event data)</w:t>
+      </w:r>
+      <w:r>
+        <w:rPr>
+          <w:b/>
+          <w:bCs/>
+        </w:rPr>
+        <w:t xml:space="preserve"> </w:t>
+      </w:r>
+      <w:r>
+        <w:t xml:space="preserve">ensures that if the schedule is successfully committed to PostgreSQL, the corresponding event </w:t>
+      </w:r>
+      <w:r>
+        <w:t>also persisted</w:t>
+      </w:r>
+      <w:r>
+        <w:t xml:space="preserve"> and can later be published to Kafka via </w:t>
+      </w:r>
+      <w:proofErr w:type="spellStart"/>
+      <w:r>
+        <w:t>Debezium</w:t>
+      </w:r>
+      <w:proofErr w:type="spellEnd"/>
+      <w:r>
+        <w:t xml:space="preserve"> CDC, preventing lost or inconsistent events.</w:t>
+      </w:r>
+    </w:p>
+    <w:p/>
+    <w:p>
+      <w:r>
+        <w:t xml:space="preserve">A </w:t>
+      </w:r>
+      <w:r>
+        <w:rPr>
+          <w:b/>
+          <w:bCs/>
+        </w:rPr>
+        <w:t xml:space="preserve">Projector (or </w:t>
+      </w:r>
+      <w:proofErr w:type="spellStart"/>
+      <w:r>
+        <w:rPr>
+          <w:b/>
+          <w:bCs/>
+        </w:rPr>
+        <w:t>Updator</w:t>
+      </w:r>
+      <w:proofErr w:type="spellEnd"/>
+      <w:r>
+        <w:rPr>
+          <w:b/>
+          <w:bCs/>
+        </w:rPr>
+        <w:t>) Lambda</w:t>
       </w:r>
       <w:r>
         <w:t xml:space="preserve"> </w:t>
@@ -420,8 +460,13 @@
         <w:t>)</w:t>
       </w:r>
       <w:r>
-        <w:t xml:space="preserve"> solutions such as Debezium</w:t>
-      </w:r>
+        <w:t xml:space="preserve"> solutions such as </w:t>
+      </w:r>
+      <w:proofErr w:type="spellStart"/>
+      <w:r>
+        <w:t>Debezium</w:t>
+      </w:r>
+      <w:proofErr w:type="spellEnd"/>
       <w:r>
         <w:t>.</w:t>
       </w:r>
@@ -429,7 +474,15 @@
     <w:p/>
     <w:p>
       <w:r>
-        <w:t>How Does Debezium Connect to PostgreSQL WAL</w:t>
+        <w:t xml:space="preserve">How Does </w:t>
+      </w:r>
+      <w:proofErr w:type="spellStart"/>
+      <w:r>
+        <w:t>Debezium</w:t>
+      </w:r>
+      <w:proofErr w:type="spellEnd"/>
+      <w:r>
+        <w:t xml:space="preserve"> Connect to PostgreSQL WAL</w:t>
       </w:r>
       <w:r>
         <w:t xml:space="preserve"> </w:t>
@@ -439,8 +492,13 @@
       </w:r>
     </w:p>
     <w:p>
-      <w:r>
-        <w:t xml:space="preserve">Debezium acts as the </w:t>
+      <w:proofErr w:type="spellStart"/>
+      <w:r>
+        <w:t>Debezium</w:t>
+      </w:r>
+      <w:proofErr w:type="spellEnd"/>
+      <w:r>
+        <w:t xml:space="preserve"> acts as the </w:t>
       </w:r>
       <w:r>
         <w:rPr>
@@ -454,8 +512,13 @@
       </w:r>
     </w:p>
     <w:p>
-      <w:r>
-        <w:t xml:space="preserve">Debezium does </w:t>
+      <w:proofErr w:type="spellStart"/>
+      <w:r>
+        <w:t>Debezium</w:t>
+      </w:r>
+      <w:proofErr w:type="spellEnd"/>
+      <w:r>
+        <w:t xml:space="preserve"> does </w:t>
       </w:r>
       <w:r>
         <w:rPr>
@@ -475,8 +538,17 @@
           <w:i/>
           <w:iCs/>
         </w:rPr>
-        <w:t>SELECT * FROM outbox_events</w:t>
-      </w:r>
+        <w:t xml:space="preserve">SELECT * FROM </w:t>
+      </w:r>
+      <w:proofErr w:type="spellStart"/>
+      <w:r>
+        <w:rPr>
+          <w:i/>
+          <w:iCs/>
+        </w:rPr>
+        <w:t>outbox_events</w:t>
+      </w:r>
+      <w:proofErr w:type="spellEnd"/>
     </w:p>
     <w:p>
       <w:r>
@@ -488,7 +560,15 @@
     </w:p>
     <w:p>
       <w:r>
-        <w:t xml:space="preserve">Instead, Debezium uses PostgreSQL's </w:t>
+        <w:t xml:space="preserve">Instead, </w:t>
+      </w:r>
+      <w:proofErr w:type="spellStart"/>
+      <w:r>
+        <w:t>Debezium</w:t>
+      </w:r>
+      <w:proofErr w:type="spellEnd"/>
+      <w:r>
+        <w:t xml:space="preserve"> uses PostgreSQL's </w:t>
       </w:r>
       <w:r>
         <w:rPr>
@@ -503,7 +583,15 @@
     </w:p>
     <w:p>
       <w:r>
-        <w:t>AWS RDS PostgreSQL supports logical replication, which Debezium can consume through a replication slot</w:t>
+        <w:t xml:space="preserve">AWS RDS PostgreSQL supports logical replication, which </w:t>
+      </w:r>
+      <w:proofErr w:type="spellStart"/>
+      <w:r>
+        <w:t>Debezium</w:t>
+      </w:r>
+      <w:proofErr w:type="spellEnd"/>
+      <w:r>
+        <w:t xml:space="preserve"> can consume through a replication slot</w:t>
       </w:r>
       <w:r>
         <w:t>.</w:t>
@@ -533,9 +621,11 @@
       <w:r>
         <w:t xml:space="preserve"> useful in the cases of the </w:t>
       </w:r>
+      <w:proofErr w:type="spellStart"/>
       <w:r>
         <w:t>Debezium</w:t>
       </w:r>
+      <w:proofErr w:type="spellEnd"/>
       <w:r>
         <w:t xml:space="preserve"> crash for recovery.</w:t>
       </w:r>
@@ -608,14 +698,24 @@
       </w:r>
     </w:p>
     <w:p>
+      <w:proofErr w:type="spellStart"/>
       <w:r>
         <w:t>Debezium</w:t>
       </w:r>
+      <w:proofErr w:type="spellEnd"/>
     </w:p>
     <w:p/>
     <w:p>
       <w:r>
-        <w:t>Confluent handles the entire Kafka ecosystem, including Kafka Connect and Debezium management.</w:t>
+        <w:t xml:space="preserve">Confluent handles the entire Kafka ecosystem, including Kafka Connect and </w:t>
+      </w:r>
+      <w:proofErr w:type="spellStart"/>
+      <w:r>
+        <w:t>Debezium</w:t>
+      </w:r>
+      <w:proofErr w:type="spellEnd"/>
+      <w:r>
+        <w:t xml:space="preserve"> management.</w:t>
       </w:r>
     </w:p>
     <w:p>
@@ -625,9 +725,11 @@
       <w:r>
         <w:t xml:space="preserve"> is runtime for </w:t>
       </w:r>
+      <w:proofErr w:type="spellStart"/>
       <w:r>
         <w:t>Debezium</w:t>
       </w:r>
+      <w:proofErr w:type="spellEnd"/>
       <w:r>
         <w:t xml:space="preserve"> CDC , it does not need to be </w:t>
       </w:r>
@@ -642,7 +744,23 @@
         <w:pStyle w:val="Heading1"/>
       </w:pPr>
       <w:r>
-        <w:t>Reduced p95 API latency from 420 ms to 170 ms by adding Redis caching, optimizing slow SQL queries, and tuning JVM garbage collector settings.</w:t>
+        <w:t xml:space="preserve">Reduced p95 API latency from 420 </w:t>
+      </w:r>
+      <w:proofErr w:type="spellStart"/>
+      <w:r>
+        <w:t>ms</w:t>
+      </w:r>
+      <w:proofErr w:type="spellEnd"/>
+      <w:r>
+        <w:t xml:space="preserve"> to 170 </w:t>
+      </w:r>
+      <w:proofErr w:type="spellStart"/>
+      <w:r>
+        <w:t>ms</w:t>
+      </w:r>
+      <w:proofErr w:type="spellEnd"/>
+      <w:r>
+        <w:t xml:space="preserve"> by adding Redis caching, optimizing slow SQL queries, and tuning JVM garbage collector settings.</w:t>
       </w:r>
     </w:p>
     <w:p>
@@ -763,7 +881,27 @@
           <w:lang w:val="en-US"/>
           <w14:ligatures w14:val="none"/>
         </w:rPr>
-        <w:t xml:space="preserve">p95 = 420 ms means: </w:t>
+        <w:t xml:space="preserve">p95 = 420 </w:t>
+      </w:r>
+      <w:proofErr w:type="spellStart"/>
+      <w:r>
+        <w:rPr>
+          <w:rFonts w:ascii="Aptos" w:eastAsia="Times New Roman" w:hAnsi="Aptos" w:cs="Times New Roman"/>
+          <w:kern w:val="0"/>
+          <w:lang w:val="en-US"/>
+          <w14:ligatures w14:val="none"/>
+        </w:rPr>
+        <w:t>ms</w:t>
+      </w:r>
+      <w:proofErr w:type="spellEnd"/>
+      <w:r>
+        <w:rPr>
+          <w:rFonts w:ascii="Aptos" w:eastAsia="Times New Roman" w:hAnsi="Aptos" w:cs="Times New Roman"/>
+          <w:kern w:val="0"/>
+          <w:lang w:val="en-US"/>
+          <w14:ligatures w14:val="none"/>
+        </w:rPr>
+        <w:t xml:space="preserve"> means: </w:t>
       </w:r>
     </w:p>
     <w:p>
@@ -820,23 +958,54 @@
         </w:rPr>
         <w:t xml:space="preserve">95 </w:t>
       </w:r>
-      <w:r>
-        <w:rPr>
-          <w:rFonts w:ascii="Aptos" w:eastAsia="Times New Roman" w:hAnsi="Aptos" w:cs="Times New Roman"/>
-          <w:kern w:val="0"/>
-          <w:lang w:val="en-US"/>
-          <w14:ligatures w14:val="none"/>
-        </w:rPr>
-        <w:t>th request</w:t>
-      </w:r>
-      <w:r>
-        <w:rPr>
-          <w:rFonts w:ascii="Aptos" w:eastAsia="Times New Roman" w:hAnsi="Aptos" w:cs="Times New Roman"/>
-          <w:kern w:val="0"/>
-          <w:lang w:val="en-US"/>
-          <w14:ligatures w14:val="none"/>
-        </w:rPr>
-        <w:t xml:space="preserve"> completed within 420 ms </w:t>
+      <w:proofErr w:type="spellStart"/>
+      <w:r>
+        <w:rPr>
+          <w:rFonts w:ascii="Aptos" w:eastAsia="Times New Roman" w:hAnsi="Aptos" w:cs="Times New Roman"/>
+          <w:kern w:val="0"/>
+          <w:lang w:val="en-US"/>
+          <w14:ligatures w14:val="none"/>
+        </w:rPr>
+        <w:t>th</w:t>
+      </w:r>
+      <w:proofErr w:type="spellEnd"/>
+      <w:r>
+        <w:rPr>
+          <w:rFonts w:ascii="Aptos" w:eastAsia="Times New Roman" w:hAnsi="Aptos" w:cs="Times New Roman"/>
+          <w:kern w:val="0"/>
+          <w:lang w:val="en-US"/>
+          <w14:ligatures w14:val="none"/>
+        </w:rPr>
+        <w:t xml:space="preserve"> request</w:t>
+      </w:r>
+      <w:r>
+        <w:rPr>
+          <w:rFonts w:ascii="Aptos" w:eastAsia="Times New Roman" w:hAnsi="Aptos" w:cs="Times New Roman"/>
+          <w:kern w:val="0"/>
+          <w:lang w:val="en-US"/>
+          <w14:ligatures w14:val="none"/>
+        </w:rPr>
+        <w:t xml:space="preserve"> completed within 420 </w:t>
+      </w:r>
+      <w:proofErr w:type="spellStart"/>
+      <w:r>
+        <w:rPr>
+          <w:rFonts w:ascii="Aptos" w:eastAsia="Times New Roman" w:hAnsi="Aptos" w:cs="Times New Roman"/>
+          <w:kern w:val="0"/>
+          <w:lang w:val="en-US"/>
+          <w14:ligatures w14:val="none"/>
+        </w:rPr>
+        <w:t>ms</w:t>
+      </w:r>
+      <w:proofErr w:type="spellEnd"/>
+      <w:r>
+        <w:rPr>
+          <w:rFonts w:ascii="Aptos" w:eastAsia="Times New Roman" w:hAnsi="Aptos" w:cs="Times New Roman"/>
+          <w:kern w:val="0"/>
+          <w:lang w:val="en-US"/>
+          <w14:ligatures w14:val="none"/>
+        </w:rPr>
+        <w:t> </w:t>
       </w:r>
     </w:p>
     <w:p>
@@ -869,7 +1038,27 @@
           <w:lang w:val="en-US"/>
           <w14:ligatures w14:val="none"/>
         </w:rPr>
-        <w:t xml:space="preserve">Why Redis here? why not the Ehcache ? </w:t>
+        <w:t xml:space="preserve">Why Redis here? why not the </w:t>
+      </w:r>
+      <w:proofErr w:type="spellStart"/>
+      <w:r>
+        <w:rPr>
+          <w:rFonts w:ascii="Aptos" w:eastAsia="Times New Roman" w:hAnsi="Aptos" w:cs="Times New Roman"/>
+          <w:kern w:val="0"/>
+          <w:lang w:val="en-US"/>
+          <w14:ligatures w14:val="none"/>
+        </w:rPr>
+        <w:t>Ehcache</w:t>
+      </w:r>
+      <w:proofErr w:type="spellEnd"/>
+      <w:r>
+        <w:rPr>
+          <w:rFonts w:ascii="Aptos" w:eastAsia="Times New Roman" w:hAnsi="Aptos" w:cs="Times New Roman"/>
+          <w:kern w:val="0"/>
+          <w:lang w:val="en-US"/>
+          <w14:ligatures w14:val="none"/>
+        </w:rPr>
+        <w:t xml:space="preserve"> ? </w:t>
       </w:r>
     </w:p>
     <w:p>
@@ -949,6 +1138,7 @@
           <w14:ligatures w14:val="none"/>
         </w:rPr>
       </w:pPr>
+      <w:proofErr w:type="spellStart"/>
       <w:r>
         <w:rPr>
           <w:rFonts w:ascii="Aptos" w:eastAsia="Times New Roman" w:hAnsi="Aptos" w:cs="Times New Roman"/>
@@ -959,6 +1149,7 @@
         </w:rPr>
         <w:t>Ehcache</w:t>
       </w:r>
+      <w:proofErr w:type="spellEnd"/>
       <w:r>
         <w:rPr>
           <w:rFonts w:ascii="Aptos" w:eastAsia="Times New Roman" w:hAnsi="Aptos" w:cs="Times New Roman"/>
@@ -1238,11 +1429,19 @@
           <w:lang w:val="en-US"/>
         </w:rPr>
       </w:pPr>
-      <w:r>
-        <w:rPr>
-          <w:lang w:val="en-US"/>
-        </w:rPr>
-        <w:t>server.tomcat.threads.max=100</w:t>
+      <w:proofErr w:type="spellStart"/>
+      <w:r>
+        <w:rPr>
+          <w:lang w:val="en-US"/>
+        </w:rPr>
+        <w:t>server.tomcat.threads.max</w:t>
+      </w:r>
+      <w:proofErr w:type="spellEnd"/>
+      <w:r>
+        <w:rPr>
+          <w:lang w:val="en-US"/>
+        </w:rPr>
+        <w:t>=100</w:t>
       </w:r>
     </w:p>
     <w:p>
@@ -1308,60 +1507,124 @@
         <w:rPr>
           <w:lang w:val="en-US"/>
         </w:rPr>
-        <w:t xml:space="preserve">When there were around 95 concurrent requests per pod , we have started seeing these requests taking more than 400 ms , </w:t>
-      </w:r>
-    </w:p>
-    <w:p>
-      <w:pPr>
-        <w:rPr>
-          <w:lang w:val="en-US"/>
-        </w:rPr>
-      </w:pPr>
-      <w:r>
-        <w:rPr>
-          <w:lang w:val="en-US"/>
-        </w:rPr>
-        <w:t>hence they got timedout.</w:t>
-      </w:r>
-    </w:p>
-    <w:p>
-      <w:pPr>
-        <w:rPr>
-          <w:lang w:val="en-US"/>
-        </w:rPr>
-      </w:pPr>
-    </w:p>
-    <w:p>
-      <w:pPr>
-        <w:rPr>
-          <w:lang w:val="en-US"/>
-        </w:rPr>
-      </w:pPr>
-      <w:r>
-        <w:rPr>
-          <w:lang w:val="en-US"/>
-        </w:rPr>
-        <w:t>i)How do we calculate the request time ( time taken per request completion ) using prometheus ?</w:t>
-      </w:r>
-    </w:p>
-    <w:p>
-      <w:pPr>
-        <w:rPr>
-          <w:lang w:val="en-US"/>
-        </w:rPr>
-      </w:pPr>
-    </w:p>
-    <w:p>
-      <w:pPr>
-        <w:rPr>
-          <w:lang w:val="en-US"/>
-        </w:rPr>
-      </w:pPr>
-      <w:r>
-        <w:rPr>
-          <w:lang w:val="en-US"/>
-        </w:rPr>
-        <w:t>Using Prometheus HTTP request duration metrics (e.g., http_server_requests_seconds )</w:t>
+        <w:t xml:space="preserve">When there were around 95 concurrent requests per pod , we have started seeing these requests taking more than 400 </w:t>
+      </w:r>
+      <w:proofErr w:type="spellStart"/>
+      <w:r>
+        <w:rPr>
+          <w:lang w:val="en-US"/>
+        </w:rPr>
+        <w:t>ms</w:t>
+      </w:r>
+      <w:proofErr w:type="spellEnd"/>
+      <w:r>
+        <w:rPr>
+          <w:lang w:val="en-US"/>
+        </w:rPr>
+        <w:t xml:space="preserve"> , </w:t>
+      </w:r>
+    </w:p>
+    <w:p>
+      <w:pPr>
+        <w:rPr>
+          <w:lang w:val="en-US"/>
+        </w:rPr>
+      </w:pPr>
+      <w:r>
+        <w:rPr>
+          <w:lang w:val="en-US"/>
+        </w:rPr>
+        <w:t xml:space="preserve">hence they got </w:t>
+      </w:r>
+      <w:proofErr w:type="spellStart"/>
+      <w:r>
+        <w:rPr>
+          <w:lang w:val="en-US"/>
+        </w:rPr>
+        <w:t>timedout</w:t>
+      </w:r>
+      <w:proofErr w:type="spellEnd"/>
+      <w:r>
+        <w:rPr>
+          <w:lang w:val="en-US"/>
+        </w:rPr>
+        <w:t>.</w:t>
+      </w:r>
+    </w:p>
+    <w:p>
+      <w:pPr>
+        <w:rPr>
+          <w:lang w:val="en-US"/>
+        </w:rPr>
+      </w:pPr>
+    </w:p>
+    <w:p>
+      <w:pPr>
+        <w:rPr>
+          <w:lang w:val="en-US"/>
+        </w:rPr>
+      </w:pPr>
+      <w:proofErr w:type="spellStart"/>
+      <w:r>
+        <w:rPr>
+          <w:lang w:val="en-US"/>
+        </w:rPr>
+        <w:t>i</w:t>
+      </w:r>
+      <w:proofErr w:type="spellEnd"/>
+      <w:r>
+        <w:rPr>
+          <w:lang w:val="en-US"/>
+        </w:rPr>
+        <w:t xml:space="preserve">)How do we calculate the request time ( time taken per request completion ) using </w:t>
+      </w:r>
+      <w:proofErr w:type="spellStart"/>
+      <w:r>
+        <w:rPr>
+          <w:lang w:val="en-US"/>
+        </w:rPr>
+        <w:t>prometheus</w:t>
+      </w:r>
+      <w:proofErr w:type="spellEnd"/>
+      <w:r>
+        <w:rPr>
+          <w:lang w:val="en-US"/>
+        </w:rPr>
+        <w:t xml:space="preserve"> ?</w:t>
+      </w:r>
+    </w:p>
+    <w:p>
+      <w:pPr>
+        <w:rPr>
+          <w:lang w:val="en-US"/>
+        </w:rPr>
+      </w:pPr>
+    </w:p>
+    <w:p>
+      <w:pPr>
+        <w:rPr>
+          <w:lang w:val="en-US"/>
+        </w:rPr>
+      </w:pPr>
+      <w:r>
+        <w:rPr>
+          <w:lang w:val="en-US"/>
+        </w:rPr>
+        <w:t xml:space="preserve">Using Prometheus HTTP request duration metrics (e.g., </w:t>
+      </w:r>
+      <w:proofErr w:type="spellStart"/>
+      <w:r>
+        <w:rPr>
+          <w:lang w:val="en-US"/>
+        </w:rPr>
+        <w:t>http_server_requests_seconds</w:t>
+      </w:r>
+      <w:proofErr w:type="spellEnd"/>
+      <w:r>
+        <w:rPr>
+          <w:lang w:val="en-US"/>
+        </w:rPr>
+        <w:t xml:space="preserve"> )</w:t>
       </w:r>
     </w:p>
     <w:p>
@@ -1414,7 +1677,21 @@
         <w:rPr>
           <w:lang w:val="en-US"/>
         </w:rPr>
-        <w:t xml:space="preserve">Calculated p95 latency using histogram quantiles to be displayed on Graphana. This gave us the request completion </w:t>
+        <w:t xml:space="preserve">Calculated p95 latency using histogram quantiles to be displayed on </w:t>
+      </w:r>
+      <w:proofErr w:type="spellStart"/>
+      <w:r>
+        <w:rPr>
+          <w:lang w:val="en-US"/>
+        </w:rPr>
+        <w:t>Graphana</w:t>
+      </w:r>
+      <w:proofErr w:type="spellEnd"/>
+      <w:r>
+        <w:rPr>
+          <w:lang w:val="en-US"/>
+        </w:rPr>
+        <w:t xml:space="preserve">. This gave us the request completion </w:t>
       </w:r>
     </w:p>
     <w:p>
@@ -1671,11 +1948,19 @@
           <w:lang w:val="en-US"/>
         </w:rPr>
       </w:pPr>
-      <w:r>
-        <w:rPr>
-          <w:lang w:val="en-US"/>
-        </w:rPr>
-        <w:t>i)</w:t>
+      <w:proofErr w:type="spellStart"/>
+      <w:r>
+        <w:rPr>
+          <w:lang w:val="en-US"/>
+        </w:rPr>
+        <w:t>i</w:t>
+      </w:r>
+      <w:proofErr w:type="spellEnd"/>
+      <w:r>
+        <w:rPr>
+          <w:lang w:val="en-US"/>
+        </w:rPr>
+        <w:t>)</w:t>
       </w:r>
       <w:r>
         <w:rPr>
@@ -1751,7 +2036,21 @@
         <w:rPr>
           <w:lang w:val="en-US"/>
         </w:rPr>
-        <w:t xml:space="preserve">ii)How redis caching helps solve this </w:t>
+        <w:t xml:space="preserve">ii)How </w:t>
+      </w:r>
+      <w:proofErr w:type="spellStart"/>
+      <w:r>
+        <w:rPr>
+          <w:lang w:val="en-US"/>
+        </w:rPr>
+        <w:t>redis</w:t>
+      </w:r>
+      <w:proofErr w:type="spellEnd"/>
+      <w:r>
+        <w:rPr>
+          <w:lang w:val="en-US"/>
+        </w:rPr>
+        <w:t xml:space="preserve"> caching helps solve this </w:t>
       </w:r>
       <w:r>
         <w:rPr>
@@ -1813,7 +2112,21 @@
         <w:rPr>
           <w:lang w:val="en-US"/>
         </w:rPr>
-        <w:t xml:space="preserve"> the db queries resulted to larger result sets holding more than 30k records</w:t>
+        <w:t xml:space="preserve"> the </w:t>
+      </w:r>
+      <w:proofErr w:type="spellStart"/>
+      <w:r>
+        <w:rPr>
+          <w:lang w:val="en-US"/>
+        </w:rPr>
+        <w:t>db</w:t>
+      </w:r>
+      <w:proofErr w:type="spellEnd"/>
+      <w:r>
+        <w:rPr>
+          <w:lang w:val="en-US"/>
+        </w:rPr>
+        <w:t xml:space="preserve"> queries resulted to larger result sets holding more than 30k records</w:t>
       </w:r>
       <w:r>
         <w:rPr>
@@ -1911,11 +2224,19 @@
           <w:lang w:val="en-US"/>
         </w:rPr>
       </w:pPr>
-      <w:r>
-        <w:rPr>
-          <w:lang w:val="en-US"/>
-        </w:rPr>
-        <w:t>i)GC pauses</w:t>
+      <w:proofErr w:type="spellStart"/>
+      <w:r>
+        <w:rPr>
+          <w:lang w:val="en-US"/>
+        </w:rPr>
+        <w:t>i</w:t>
+      </w:r>
+      <w:proofErr w:type="spellEnd"/>
+      <w:r>
+        <w:rPr>
+          <w:lang w:val="en-US"/>
+        </w:rPr>
+        <w:t>)GC pauses</w:t>
       </w:r>
     </w:p>
     <w:p>
@@ -1941,7 +2262,21 @@
         <w:rPr>
           <w:lang w:val="en-US"/>
         </w:rPr>
-        <w:t>(-XX:+UseG1GC, -XX:MaxGCPauseMillis=200) significantly reduces GC frequency and pause times.</w:t>
+        <w:t>(-XX:+UseG1GC, -</w:t>
+      </w:r>
+      <w:proofErr w:type="spellStart"/>
+      <w:r>
+        <w:rPr>
+          <w:lang w:val="en-US"/>
+        </w:rPr>
+        <w:t>XX:MaxGCPauseMillis</w:t>
+      </w:r>
+      <w:proofErr w:type="spellEnd"/>
+      <w:r>
+        <w:rPr>
+          <w:lang w:val="en-US"/>
+        </w:rPr>
+        <w:t>=200) significantly reduces GC frequency and pause times.</w:t>
       </w:r>
     </w:p>
     <w:p>
@@ -1974,7 +2309,35 @@
         <w:rPr>
           <w:lang w:val="en-US"/>
         </w:rPr>
-        <w:t>We can tune JVM heap sizing (-Xms, -Xmx) within the pod memory limits.</w:t>
+        <w:t>We can tune JVM heap sizing (-</w:t>
+      </w:r>
+      <w:proofErr w:type="spellStart"/>
+      <w:r>
+        <w:rPr>
+          <w:lang w:val="en-US"/>
+        </w:rPr>
+        <w:t>Xms</w:t>
+      </w:r>
+      <w:proofErr w:type="spellEnd"/>
+      <w:r>
+        <w:rPr>
+          <w:lang w:val="en-US"/>
+        </w:rPr>
+        <w:t>, -</w:t>
+      </w:r>
+      <w:proofErr w:type="spellStart"/>
+      <w:r>
+        <w:rPr>
+          <w:lang w:val="en-US"/>
+        </w:rPr>
+        <w:t>Xmx</w:t>
+      </w:r>
+      <w:proofErr w:type="spellEnd"/>
+      <w:r>
+        <w:rPr>
+          <w:lang w:val="en-US"/>
+        </w:rPr>
+        <w:t>) within the pod memory limits.</w:t>
       </w:r>
     </w:p>
     <w:p>
@@ -2414,7 +2777,27 @@
           <w:lang w:val="en-US"/>
           <w14:ligatures w14:val="none"/>
         </w:rPr>
-        <w:t xml:space="preserve"> , whenever the Crew Query Service exceeded the SLO threshold of 200 ms , it triggers the alert to the operations team.</w:t>
+        <w:t xml:space="preserve"> , whenever the Crew Query Service exceeded the SLO threshold of 200 </w:t>
+      </w:r>
+      <w:proofErr w:type="spellStart"/>
+      <w:r>
+        <w:rPr>
+          <w:rFonts w:ascii="Aptos" w:eastAsia="Times New Roman" w:hAnsi="Aptos" w:cs="Times New Roman"/>
+          <w:kern w:val="0"/>
+          <w:lang w:val="en-US"/>
+          <w14:ligatures w14:val="none"/>
+        </w:rPr>
+        <w:t>ms</w:t>
+      </w:r>
+      <w:proofErr w:type="spellEnd"/>
+      <w:r>
+        <w:rPr>
+          <w:rFonts w:ascii="Aptos" w:eastAsia="Times New Roman" w:hAnsi="Aptos" w:cs="Times New Roman"/>
+          <w:kern w:val="0"/>
+          <w:lang w:val="en-US"/>
+          <w14:ligatures w14:val="none"/>
+        </w:rPr>
+        <w:t xml:space="preserve"> , it triggers the alert to the operations team.</w:t>
       </w:r>
       <w:r>
         <w:rPr>
@@ -3413,6 +3796,7 @@
         </w:rPr>
         <w:t xml:space="preserve"> or </w:t>
       </w:r>
+      <w:proofErr w:type="spellStart"/>
       <w:r>
         <w:rPr>
           <w:rFonts w:ascii="Aptos" w:hAnsi="Aptos"/>
@@ -3421,6 +3805,7 @@
         </w:rPr>
         <w:t>pull_request</w:t>
       </w:r>
+      <w:proofErr w:type="spellEnd"/>
       <w:r>
         <w:rPr>
           <w:rFonts w:ascii="Aptos" w:hAnsi="Aptos"/>
@@ -5380,95 +5765,56 @@
           <w:lang w:val="en-US"/>
           <w14:ligatures w14:val="none"/>
         </w:rPr>
-        <w:t>Horizontal Pod Autoscaler (HPA).</w:t>
-      </w:r>
-    </w:p>
-    <w:p>
-      <w:pPr>
-        <w:spacing w:after="0" w:line="240" w:lineRule="auto"/>
-        <w:ind w:left="540"/>
-        <w:rPr>
-          <w:rFonts w:ascii="Aptos" w:eastAsia="Times New Roman" w:hAnsi="Aptos" w:cs="Times New Roman"/>
-          <w:kern w:val="0"/>
-          <w:lang w:val="en-US"/>
-          <w14:ligatures w14:val="none"/>
-        </w:rPr>
-      </w:pPr>
-      <w:r>
-        <w:rPr>
-          <w:rFonts w:ascii="Aptos" w:eastAsia="Times New Roman" w:hAnsi="Aptos" w:cs="Times New Roman"/>
-          <w:kern w:val="0"/>
-          <w:lang w:val="en-US"/>
-          <w14:ligatures w14:val="none"/>
-        </w:rPr>
-        <w:t> </w:t>
-      </w:r>
-    </w:p>
-    <w:p>
-      <w:pPr>
-        <w:spacing w:after="0" w:line="240" w:lineRule="auto"/>
-        <w:ind w:left="540"/>
-        <w:rPr>
-          <w:rFonts w:ascii="Aptos" w:eastAsia="Times New Roman" w:hAnsi="Aptos" w:cs="Times New Roman"/>
-          <w:kern w:val="0"/>
-          <w:lang w:val="en-US"/>
-          <w14:ligatures w14:val="none"/>
-        </w:rPr>
-      </w:pPr>
-      <w:r>
-        <w:rPr>
-          <w:rFonts w:ascii="Aptos" w:eastAsia="Times New Roman" w:hAnsi="Aptos" w:cs="Times New Roman"/>
+        <w:t xml:space="preserve">Horizontal Pod </w:t>
+      </w:r>
+      <w:proofErr w:type="spellStart"/>
+      <w:r>
+        <w:rPr>
+          <w:rFonts w:ascii="Aptos" w:eastAsia="Times New Roman" w:hAnsi="Aptos" w:cs="Times New Roman"/>
+          <w:b/>
+          <w:bCs/>
           <w:i/>
           <w:iCs/>
           <w:kern w:val="0"/>
           <w:lang w:val="en-US"/>
           <w14:ligatures w14:val="none"/>
         </w:rPr>
-        <w:t>Example:</w:t>
-      </w:r>
-    </w:p>
-    <w:p>
-      <w:pPr>
-        <w:spacing w:after="0" w:line="240" w:lineRule="auto"/>
-        <w:ind w:left="540"/>
-        <w:rPr>
-          <w:rFonts w:ascii="Aptos" w:eastAsia="Times New Roman" w:hAnsi="Aptos" w:cs="Times New Roman"/>
-          <w:kern w:val="0"/>
-          <w:lang w:val="en-US"/>
-          <w14:ligatures w14:val="none"/>
-        </w:rPr>
-      </w:pPr>
-      <w:r>
-        <w:rPr>
-          <w:rFonts w:ascii="Aptos" w:eastAsia="Times New Roman" w:hAnsi="Aptos" w:cs="Times New Roman"/>
-          <w:kern w:val="0"/>
-          <w:lang w:val="en-US"/>
-          <w14:ligatures w14:val="none"/>
-        </w:rPr>
-        <w:t> </w:t>
-      </w:r>
-    </w:p>
-    <w:p>
-      <w:pPr>
-        <w:spacing w:after="0" w:line="240" w:lineRule="auto"/>
-        <w:ind w:left="540"/>
-        <w:rPr>
-          <w:rFonts w:ascii="Aptos" w:eastAsia="Times New Roman" w:hAnsi="Aptos" w:cs="Times New Roman"/>
-          <w:kern w:val="0"/>
-          <w:lang w:val="en-US"/>
-          <w14:ligatures w14:val="none"/>
-        </w:rPr>
-      </w:pPr>
-      <w:r>
-        <w:rPr>
-          <w:rFonts w:ascii="Aptos" w:eastAsia="Times New Roman" w:hAnsi="Aptos" w:cs="Times New Roman"/>
+        <w:t>Autoscaler</w:t>
+      </w:r>
+      <w:proofErr w:type="spellEnd"/>
+      <w:r>
+        <w:rPr>
+          <w:rFonts w:ascii="Aptos" w:eastAsia="Times New Roman" w:hAnsi="Aptos" w:cs="Times New Roman"/>
+          <w:b/>
+          <w:bCs/>
           <w:i/>
           <w:iCs/>
           <w:kern w:val="0"/>
           <w:lang w:val="en-US"/>
           <w14:ligatures w14:val="none"/>
         </w:rPr>
-        <w:t>CPU &gt; 80%</w:t>
+        <w:t xml:space="preserve"> (HPA).</w:t>
+      </w:r>
+    </w:p>
+    <w:p>
+      <w:pPr>
+        <w:spacing w:after="0" w:line="240" w:lineRule="auto"/>
+        <w:ind w:left="540"/>
+        <w:rPr>
+          <w:rFonts w:ascii="Aptos" w:eastAsia="Times New Roman" w:hAnsi="Aptos" w:cs="Times New Roman"/>
+          <w:kern w:val="0"/>
+          <w:lang w:val="en-US"/>
+          <w14:ligatures w14:val="none"/>
+        </w:rPr>
+      </w:pPr>
+      <w:r>
+        <w:rPr>
+          <w:rFonts w:ascii="Aptos" w:eastAsia="Times New Roman" w:hAnsi="Aptos" w:cs="Times New Roman"/>
+          <w:kern w:val="0"/>
+          <w:lang w:val="en-US"/>
+          <w14:ligatures w14:val="none"/>
+        </w:rPr>
+        <w:t> </w:t>
       </w:r>
     </w:p>
     <w:p>
@@ -5491,6 +5837,73 @@
           <w:lang w:val="en-US"/>
           <w14:ligatures w14:val="none"/>
         </w:rPr>
+        <w:t>Example:</w:t>
+      </w:r>
+    </w:p>
+    <w:p>
+      <w:pPr>
+        <w:spacing w:after="0" w:line="240" w:lineRule="auto"/>
+        <w:ind w:left="540"/>
+        <w:rPr>
+          <w:rFonts w:ascii="Aptos" w:eastAsia="Times New Roman" w:hAnsi="Aptos" w:cs="Times New Roman"/>
+          <w:kern w:val="0"/>
+          <w:lang w:val="en-US"/>
+          <w14:ligatures w14:val="none"/>
+        </w:rPr>
+      </w:pPr>
+      <w:r>
+        <w:rPr>
+          <w:rFonts w:ascii="Aptos" w:eastAsia="Times New Roman" w:hAnsi="Aptos" w:cs="Times New Roman"/>
+          <w:kern w:val="0"/>
+          <w:lang w:val="en-US"/>
+          <w14:ligatures w14:val="none"/>
+        </w:rPr>
+        <w:t> </w:t>
+      </w:r>
+    </w:p>
+    <w:p>
+      <w:pPr>
+        <w:spacing w:after="0" w:line="240" w:lineRule="auto"/>
+        <w:ind w:left="540"/>
+        <w:rPr>
+          <w:rFonts w:ascii="Aptos" w:eastAsia="Times New Roman" w:hAnsi="Aptos" w:cs="Times New Roman"/>
+          <w:kern w:val="0"/>
+          <w:lang w:val="en-US"/>
+          <w14:ligatures w14:val="none"/>
+        </w:rPr>
+      </w:pPr>
+      <w:r>
+        <w:rPr>
+          <w:rFonts w:ascii="Aptos" w:eastAsia="Times New Roman" w:hAnsi="Aptos" w:cs="Times New Roman"/>
+          <w:i/>
+          <w:iCs/>
+          <w:kern w:val="0"/>
+          <w:lang w:val="en-US"/>
+          <w14:ligatures w14:val="none"/>
+        </w:rPr>
+        <w:t>CPU &gt; 80%</w:t>
+      </w:r>
+    </w:p>
+    <w:p>
+      <w:pPr>
+        <w:spacing w:after="0" w:line="240" w:lineRule="auto"/>
+        <w:ind w:left="540"/>
+        <w:rPr>
+          <w:rFonts w:ascii="Aptos" w:eastAsia="Times New Roman" w:hAnsi="Aptos" w:cs="Times New Roman"/>
+          <w:kern w:val="0"/>
+          <w:lang w:val="en-US"/>
+          <w14:ligatures w14:val="none"/>
+        </w:rPr>
+      </w:pPr>
+      <w:r>
+        <w:rPr>
+          <w:rFonts w:ascii="Aptos" w:eastAsia="Times New Roman" w:hAnsi="Aptos" w:cs="Times New Roman"/>
+          <w:i/>
+          <w:iCs/>
+          <w:kern w:val="0"/>
+          <w:lang w:val="en-US"/>
+          <w14:ligatures w14:val="none"/>
+        </w:rPr>
         <w:t>Increase Pods from 3 → 10</w:t>
       </w:r>
     </w:p>
@@ -5580,20 +5993,9 @@
           <w:lang w:val="en-US"/>
           <w14:ligatures w14:val="none"/>
         </w:rPr>
-        <w:t xml:space="preserve">Horizontal Pod Autoscaler (HPA) </w:t>
-      </w:r>
-    </w:p>
-    <w:p>
-      <w:pPr>
-        <w:spacing w:after="0" w:line="240" w:lineRule="auto"/>
-        <w:ind w:left="540"/>
-        <w:rPr>
-          <w:rFonts w:ascii="Aptos" w:eastAsia="Times New Roman" w:hAnsi="Aptos" w:cs="Times New Roman"/>
-          <w:kern w:val="0"/>
-          <w:lang w:val="en-US"/>
-          <w14:ligatures w14:val="none"/>
-        </w:rPr>
-      </w:pPr>
+        <w:t xml:space="preserve">Horizontal Pod </w:t>
+      </w:r>
+      <w:proofErr w:type="spellStart"/>
       <w:r>
         <w:rPr>
           <w:rFonts w:ascii="Aptos" w:eastAsia="Times New Roman" w:hAnsi="Aptos" w:cs="Times New Roman"/>
@@ -5603,68 +6005,9 @@
           <w:lang w:val="en-US"/>
           <w14:ligatures w14:val="none"/>
         </w:rPr>
-        <w:t>Scales pod replicas based on metrics (CPU, memory )</w:t>
-      </w:r>
-    </w:p>
-    <w:p>
-      <w:pPr>
-        <w:spacing w:after="0" w:line="240" w:lineRule="auto"/>
-        <w:rPr>
-          <w:rFonts w:ascii="Aptos" w:eastAsia="Times New Roman" w:hAnsi="Aptos" w:cs="Times New Roman"/>
-          <w:kern w:val="0"/>
-          <w:lang w:val="en-US"/>
-          <w14:ligatures w14:val="none"/>
-        </w:rPr>
-      </w:pPr>
-      <w:r>
-        <w:rPr>
-          <w:rFonts w:ascii="Aptos" w:eastAsia="Times New Roman" w:hAnsi="Aptos" w:cs="Times New Roman"/>
-          <w:kern w:val="0"/>
-          <w:lang w:val="en-US"/>
-          <w14:ligatures w14:val="none"/>
-        </w:rPr>
-        <w:t> </w:t>
-      </w:r>
-    </w:p>
-    <w:p>
-      <w:pPr>
-        <w:spacing w:after="0" w:line="240" w:lineRule="auto"/>
-        <w:rPr>
-          <w:rFonts w:ascii="Aptos" w:eastAsia="Times New Roman" w:hAnsi="Aptos" w:cs="Times New Roman"/>
-          <w:kern w:val="0"/>
-          <w:lang w:val="en-US"/>
-          <w14:ligatures w14:val="none"/>
-        </w:rPr>
-      </w:pPr>
-      <w:r>
-        <w:rPr>
-          <w:rFonts w:ascii="Aptos" w:eastAsia="Times New Roman" w:hAnsi="Aptos" w:cs="Times New Roman"/>
-          <w:kern w:val="0"/>
-          <w:lang w:val="en-US"/>
-          <w14:ligatures w14:val="none"/>
-        </w:rPr>
-        <w:t> </w:t>
-      </w:r>
-    </w:p>
-    <w:p>
-      <w:pPr>
-        <w:spacing w:after="0" w:line="240" w:lineRule="auto"/>
-        <w:rPr>
-          <w:rFonts w:ascii="Aptos" w:eastAsia="Times New Roman" w:hAnsi="Aptos" w:cs="Times New Roman"/>
-          <w:kern w:val="0"/>
-          <w:lang w:val="en-US"/>
-          <w14:ligatures w14:val="none"/>
-        </w:rPr>
-      </w:pPr>
-      <w:r>
-        <w:rPr>
-          <w:rFonts w:ascii="Aptos" w:eastAsia="Times New Roman" w:hAnsi="Aptos" w:cs="Times New Roman"/>
-          <w:kern w:val="0"/>
-          <w:lang w:val="en-US"/>
-          <w14:ligatures w14:val="none"/>
-        </w:rPr>
-        <w:t> </w:t>
-      </w:r>
+        <w:t>Autoscaler</w:t>
+      </w:r>
+      <w:proofErr w:type="spellEnd"/>
       <w:r>
         <w:rPr>
           <w:rFonts w:ascii="Aptos" w:eastAsia="Times New Roman" w:hAnsi="Aptos" w:cs="Times New Roman"/>
@@ -5674,33 +6017,13 @@
           <w:lang w:val="en-US"/>
           <w14:ligatures w14:val="none"/>
         </w:rPr>
-        <w:t>Node-Level Scaling (Infrastructure)</w:t>
-      </w:r>
-    </w:p>
-    <w:p>
-      <w:pPr>
-        <w:spacing w:after="0" w:line="240" w:lineRule="auto"/>
-        <w:rPr>
-          <w:rFonts w:ascii="Aptos" w:eastAsia="Times New Roman" w:hAnsi="Aptos" w:cs="Times New Roman"/>
-          <w:kern w:val="0"/>
-          <w:lang w:val="en-US"/>
-          <w14:ligatures w14:val="none"/>
-        </w:rPr>
-      </w:pPr>
-      <w:r>
-        <w:rPr>
-          <w:rFonts w:ascii="Aptos" w:eastAsia="Times New Roman" w:hAnsi="Aptos" w:cs="Times New Roman"/>
-          <w:kern w:val="0"/>
-          <w:lang w:val="en-US"/>
-          <w14:ligatures w14:val="none"/>
-        </w:rPr>
-        <w:t> </w:t>
-      </w:r>
-    </w:p>
-    <w:p>
-      <w:pPr>
-        <w:spacing w:after="0" w:line="240" w:lineRule="auto"/>
-        <w:ind w:left="360"/>
+        <w:t xml:space="preserve"> (HPA) </w:t>
+      </w:r>
+    </w:p>
+    <w:p>
+      <w:pPr>
+        <w:spacing w:after="0" w:line="240" w:lineRule="auto"/>
+        <w:ind w:left="540"/>
         <w:rPr>
           <w:rFonts w:ascii="Aptos" w:eastAsia="Times New Roman" w:hAnsi="Aptos" w:cs="Times New Roman"/>
           <w:kern w:val="0"/>
@@ -5717,7 +6040,134 @@
           <w:lang w:val="en-US"/>
           <w14:ligatures w14:val="none"/>
         </w:rPr>
-        <w:t xml:space="preserve">Karpenter : </w:t>
+        <w:t>Scales pod replicas based on metrics (CPU, memory )</w:t>
+      </w:r>
+    </w:p>
+    <w:p>
+      <w:pPr>
+        <w:spacing w:after="0" w:line="240" w:lineRule="auto"/>
+        <w:rPr>
+          <w:rFonts w:ascii="Aptos" w:eastAsia="Times New Roman" w:hAnsi="Aptos" w:cs="Times New Roman"/>
+          <w:kern w:val="0"/>
+          <w:lang w:val="en-US"/>
+          <w14:ligatures w14:val="none"/>
+        </w:rPr>
+      </w:pPr>
+      <w:r>
+        <w:rPr>
+          <w:rFonts w:ascii="Aptos" w:eastAsia="Times New Roman" w:hAnsi="Aptos" w:cs="Times New Roman"/>
+          <w:kern w:val="0"/>
+          <w:lang w:val="en-US"/>
+          <w14:ligatures w14:val="none"/>
+        </w:rPr>
+        <w:t> </w:t>
+      </w:r>
+    </w:p>
+    <w:p>
+      <w:pPr>
+        <w:spacing w:after="0" w:line="240" w:lineRule="auto"/>
+        <w:rPr>
+          <w:rFonts w:ascii="Aptos" w:eastAsia="Times New Roman" w:hAnsi="Aptos" w:cs="Times New Roman"/>
+          <w:kern w:val="0"/>
+          <w:lang w:val="en-US"/>
+          <w14:ligatures w14:val="none"/>
+        </w:rPr>
+      </w:pPr>
+      <w:r>
+        <w:rPr>
+          <w:rFonts w:ascii="Aptos" w:eastAsia="Times New Roman" w:hAnsi="Aptos" w:cs="Times New Roman"/>
+          <w:kern w:val="0"/>
+          <w:lang w:val="en-US"/>
+          <w14:ligatures w14:val="none"/>
+        </w:rPr>
+        <w:t> </w:t>
+      </w:r>
+    </w:p>
+    <w:p>
+      <w:pPr>
+        <w:spacing w:after="0" w:line="240" w:lineRule="auto"/>
+        <w:rPr>
+          <w:rFonts w:ascii="Aptos" w:eastAsia="Times New Roman" w:hAnsi="Aptos" w:cs="Times New Roman"/>
+          <w:kern w:val="0"/>
+          <w:lang w:val="en-US"/>
+          <w14:ligatures w14:val="none"/>
+        </w:rPr>
+      </w:pPr>
+      <w:r>
+        <w:rPr>
+          <w:rFonts w:ascii="Aptos" w:eastAsia="Times New Roman" w:hAnsi="Aptos" w:cs="Times New Roman"/>
+          <w:kern w:val="0"/>
+          <w:lang w:val="en-US"/>
+          <w14:ligatures w14:val="none"/>
+        </w:rPr>
+        <w:t> </w:t>
+      </w:r>
+      <w:r>
+        <w:rPr>
+          <w:rFonts w:ascii="Aptos" w:eastAsia="Times New Roman" w:hAnsi="Aptos" w:cs="Times New Roman"/>
+          <w:i/>
+          <w:iCs/>
+          <w:kern w:val="0"/>
+          <w:lang w:val="en-US"/>
+          <w14:ligatures w14:val="none"/>
+        </w:rPr>
+        <w:t>Node-Level Scaling (Infrastructure)</w:t>
+      </w:r>
+    </w:p>
+    <w:p>
+      <w:pPr>
+        <w:spacing w:after="0" w:line="240" w:lineRule="auto"/>
+        <w:rPr>
+          <w:rFonts w:ascii="Aptos" w:eastAsia="Times New Roman" w:hAnsi="Aptos" w:cs="Times New Roman"/>
+          <w:kern w:val="0"/>
+          <w:lang w:val="en-US"/>
+          <w14:ligatures w14:val="none"/>
+        </w:rPr>
+      </w:pPr>
+      <w:r>
+        <w:rPr>
+          <w:rFonts w:ascii="Aptos" w:eastAsia="Times New Roman" w:hAnsi="Aptos" w:cs="Times New Roman"/>
+          <w:kern w:val="0"/>
+          <w:lang w:val="en-US"/>
+          <w14:ligatures w14:val="none"/>
+        </w:rPr>
+        <w:t> </w:t>
+      </w:r>
+    </w:p>
+    <w:p>
+      <w:pPr>
+        <w:spacing w:after="0" w:line="240" w:lineRule="auto"/>
+        <w:ind w:left="360"/>
+        <w:rPr>
+          <w:rFonts w:ascii="Aptos" w:eastAsia="Times New Roman" w:hAnsi="Aptos" w:cs="Times New Roman"/>
+          <w:kern w:val="0"/>
+          <w:lang w:val="en-US"/>
+          <w14:ligatures w14:val="none"/>
+        </w:rPr>
+      </w:pPr>
+      <w:proofErr w:type="spellStart"/>
+      <w:r>
+        <w:rPr>
+          <w:rFonts w:ascii="Aptos" w:eastAsia="Times New Roman" w:hAnsi="Aptos" w:cs="Times New Roman"/>
+          <w:i/>
+          <w:iCs/>
+          <w:kern w:val="0"/>
+          <w:lang w:val="en-US"/>
+          <w14:ligatures w14:val="none"/>
+        </w:rPr>
+        <w:t>Karpenter</w:t>
+      </w:r>
+      <w:proofErr w:type="spellEnd"/>
+      <w:r>
+        <w:rPr>
+          <w:rFonts w:ascii="Aptos" w:eastAsia="Times New Roman" w:hAnsi="Aptos" w:cs="Times New Roman"/>
+          <w:i/>
+          <w:iCs/>
+          <w:kern w:val="0"/>
+          <w:lang w:val="en-US"/>
+          <w14:ligatures w14:val="none"/>
+        </w:rPr>
+        <w:t xml:space="preserve"> : </w:t>
       </w:r>
     </w:p>
     <w:p>
@@ -6110,7 +6560,27 @@
           <w:lang w:val="en-US"/>
           <w14:ligatures w14:val="none"/>
         </w:rPr>
-        <w:t xml:space="preserve"> a tag like for EC2 , S3 , DynamoDB , RDS etc in a AWS billing cost dashboard.</w:t>
+        <w:t xml:space="preserve"> a tag like for EC2 , S3 , DynamoDB , RDS </w:t>
+      </w:r>
+      <w:proofErr w:type="spellStart"/>
+      <w:r>
+        <w:rPr>
+          <w:rFonts w:ascii="Aptos" w:eastAsia="Times New Roman" w:hAnsi="Aptos" w:cs="Times New Roman"/>
+          <w:kern w:val="0"/>
+          <w:lang w:val="en-US"/>
+          <w14:ligatures w14:val="none"/>
+        </w:rPr>
+        <w:t>etc</w:t>
+      </w:r>
+      <w:proofErr w:type="spellEnd"/>
+      <w:r>
+        <w:rPr>
+          <w:rFonts w:ascii="Aptos" w:eastAsia="Times New Roman" w:hAnsi="Aptos" w:cs="Times New Roman"/>
+          <w:kern w:val="0"/>
+          <w:lang w:val="en-US"/>
+          <w14:ligatures w14:val="none"/>
+        </w:rPr>
+        <w:t xml:space="preserve"> in a AWS billing cost dashboard.</w:t>
       </w:r>
     </w:p>
     <w:p>
@@ -6939,14 +7409,25 @@
           <w14:ligatures w14:val="none"/>
         </w:rPr>
       </w:pPr>
-      <w:r>
-        <w:rPr>
-          <w:rFonts w:ascii="Aptos" w:eastAsia="Times New Roman" w:hAnsi="Aptos" w:cs="Times New Roman"/>
-          <w:kern w:val="0"/>
-          <w:lang w:val="en-US"/>
-          <w14:ligatures w14:val="none"/>
-        </w:rPr>
-        <w:t xml:space="preserve">JaCoCo </w:t>
+      <w:proofErr w:type="spellStart"/>
+      <w:r>
+        <w:rPr>
+          <w:rFonts w:ascii="Aptos" w:eastAsia="Times New Roman" w:hAnsi="Aptos" w:cs="Times New Roman"/>
+          <w:kern w:val="0"/>
+          <w:lang w:val="en-US"/>
+          <w14:ligatures w14:val="none"/>
+        </w:rPr>
+        <w:t>JaCoCo</w:t>
+      </w:r>
+      <w:proofErr w:type="spellEnd"/>
+      <w:r>
+        <w:rPr>
+          <w:rFonts w:ascii="Aptos" w:eastAsia="Times New Roman" w:hAnsi="Aptos" w:cs="Times New Roman"/>
+          <w:kern w:val="0"/>
+          <w:lang w:val="en-US"/>
+          <w14:ligatures w14:val="none"/>
+        </w:rPr>
+        <w:t xml:space="preserve"> </w:t>
       </w:r>
     </w:p>
     <w:p>
@@ -7164,8 +7645,19 @@
           <w:lang w:val="en-US"/>
           <w14:ligatures w14:val="none"/>
         </w:rPr>
-        <w:t>Using JaCoCo</w:t>
-      </w:r>
+        <w:t xml:space="preserve">Using </w:t>
+      </w:r>
+      <w:proofErr w:type="spellStart"/>
+      <w:r>
+        <w:rPr>
+          <w:rFonts w:ascii="Aptos" w:eastAsia="Times New Roman" w:hAnsi="Aptos" w:cs="Times New Roman"/>
+          <w:kern w:val="0"/>
+          <w:lang w:val="en-US"/>
+          <w14:ligatures w14:val="none"/>
+        </w:rPr>
+        <w:t>JaCoCo</w:t>
+      </w:r>
+      <w:proofErr w:type="spellEnd"/>
     </w:p>
     <w:p>
       <w:pPr>
@@ -7331,7 +7823,15 @@
         <w:pStyle w:val="Heading1"/>
       </w:pPr>
       <w:r>
-        <w:t>Optimized Hibernate L2 caching and HikariCP connection pooling to support a 60% increase in peak concurrent users, handling 5K+ transactions per second.</w:t>
+        <w:t xml:space="preserve">Optimized Hibernate L2 caching and </w:t>
+      </w:r>
+      <w:proofErr w:type="spellStart"/>
+      <w:r>
+        <w:t>HikariCP</w:t>
+      </w:r>
+      <w:proofErr w:type="spellEnd"/>
+      <w:r>
+        <w:t xml:space="preserve"> connection pooling to support a 60% increase in peak concurrent users, handling 5K+ transactions per second.</w:t>
       </w:r>
     </w:p>
     <w:p>
@@ -8270,6 +8770,7 @@
           <w14:ligatures w14:val="none"/>
         </w:rPr>
       </w:pPr>
+      <w:proofErr w:type="spellStart"/>
       <w:r>
         <w:rPr>
           <w:rFonts w:ascii="Aptos" w:eastAsia="Times New Roman" w:hAnsi="Aptos" w:cs="Times New Roman"/>
@@ -8279,6 +8780,7 @@
         </w:rPr>
         <w:t>CrewReportWorker</w:t>
       </w:r>
+      <w:proofErr w:type="spellEnd"/>
     </w:p>
     <w:p>
       <w:pPr>
@@ -9323,7 +9825,27 @@
           <w:lang w:val="en-US"/>
           <w14:ligatures w14:val="none"/>
         </w:rPr>
-        <w:t xml:space="preserve">Kubernetes CronJob  </w:t>
+        <w:t xml:space="preserve">Kubernetes </w:t>
+      </w:r>
+      <w:proofErr w:type="spellStart"/>
+      <w:r>
+        <w:rPr>
+          <w:rFonts w:ascii="Aptos" w:eastAsia="Times New Roman" w:hAnsi="Aptos" w:cs="Times New Roman"/>
+          <w:kern w:val="0"/>
+          <w:lang w:val="en-US"/>
+          <w14:ligatures w14:val="none"/>
+        </w:rPr>
+        <w:t>CronJob</w:t>
+      </w:r>
+      <w:proofErr w:type="spellEnd"/>
+      <w:r>
+        <w:rPr>
+          <w:rFonts w:ascii="Aptos" w:eastAsia="Times New Roman" w:hAnsi="Aptos" w:cs="Times New Roman"/>
+          <w:kern w:val="0"/>
+          <w:lang w:val="en-US"/>
+          <w14:ligatures w14:val="none"/>
+        </w:rPr>
+        <w:t xml:space="preserve">  </w:t>
       </w:r>
     </w:p>
     <w:p>
@@ -10094,7 +10616,21 @@
         <w:rPr>
           <w:rFonts w:ascii="Aptos" w:hAnsi="Aptos"/>
         </w:rPr>
-        <w:t xml:space="preserve">We get customer related information ( trip , account ) from upstream systems kafka topics which will get consumed by the microservices.   </w:t>
+        <w:t xml:space="preserve">We get customer related information ( trip , account ) from upstream systems </w:t>
+      </w:r>
+      <w:proofErr w:type="spellStart"/>
+      <w:r>
+        <w:rPr>
+          <w:rFonts w:ascii="Aptos" w:hAnsi="Aptos"/>
+        </w:rPr>
+        <w:t>kafka</w:t>
+      </w:r>
+      <w:proofErr w:type="spellEnd"/>
+      <w:r>
+        <w:rPr>
+          <w:rFonts w:ascii="Aptos" w:hAnsi="Aptos"/>
+        </w:rPr>
+        <w:t xml:space="preserve"> topics which will get consumed by the microservices.   </w:t>
       </w:r>
     </w:p>
     <w:p>
@@ -10316,11 +10852,19 @@
           <w:lang w:val="en-US"/>
         </w:rPr>
       </w:pPr>
-      <w:r>
-        <w:rPr>
-          <w:lang w:val="en-US"/>
-        </w:rPr>
-        <w:t xml:space="preserve">i) It will </w:t>
+      <w:proofErr w:type="spellStart"/>
+      <w:r>
+        <w:rPr>
+          <w:lang w:val="en-US"/>
+        </w:rPr>
+        <w:t>i</w:t>
+      </w:r>
+      <w:proofErr w:type="spellEnd"/>
+      <w:r>
+        <w:rPr>
+          <w:lang w:val="en-US"/>
+        </w:rPr>
+        <w:t xml:space="preserve">) It will </w:t>
       </w:r>
       <w:r>
         <w:rPr>
@@ -10345,32 +10889,7 @@
         <w:rPr>
           <w:lang w:val="en-US"/>
         </w:rPr>
-        <w:t xml:space="preserve">ii) It will not merge from both the topics , </w:t>
-      </w:r>
-      <w:r>
-        <w:rPr>
-          <w:lang w:val="en-US"/>
-        </w:rPr>
-        <w:t>separately</w:t>
-      </w:r>
-      <w:r>
-        <w:rPr>
-          <w:lang w:val="en-US"/>
-        </w:rPr>
-        <w:t xml:space="preserve"> process them to identity topic.</w:t>
-      </w:r>
-    </w:p>
-    <w:p>
-      <w:pPr>
-        <w:rPr>
-          <w:lang w:val="en-US"/>
-        </w:rPr>
-      </w:pPr>
-      <w:r>
-        <w:rPr>
-          <w:lang w:val="en-US"/>
-        </w:rPr>
-        <w:t xml:space="preserve">iii) It will look for and pick certain attributes / data points ( tokens ) from these 2 topics and prepare the identity message so that it </w:t>
+        <w:t xml:space="preserve">ii) It will look for and pick certain attributes / data points ( tokens ) from these 2 topics and prepare the identity message so that it </w:t>
       </w:r>
       <w:r>
         <w:rPr>
@@ -10383,6 +10902,31 @@
           <w:lang w:val="en-US"/>
         </w:rPr>
         <w:t xml:space="preserve"> the unwanted information/noise and prepare selective tokens to the identity topic.</w:t>
+      </w:r>
+    </w:p>
+    <w:p>
+      <w:pPr>
+        <w:rPr>
+          <w:lang w:val="en-US"/>
+        </w:rPr>
+      </w:pPr>
+      <w:r>
+        <w:rPr>
+          <w:lang w:val="en-US"/>
+        </w:rPr>
+        <w:t>ii</w:t>
+      </w:r>
+      <w:r>
+        <w:rPr>
+          <w:lang w:val="en-US"/>
+        </w:rPr>
+        <w:t>i</w:t>
+      </w:r>
+      <w:r>
+        <w:rPr>
+          <w:lang w:val="en-US"/>
+        </w:rPr>
+        <w:t>) It will not merge from both the topics , separately process them to identity topic.</w:t>
       </w:r>
     </w:p>
     <w:p>
@@ -10620,11 +11164,19 @@
           <w:lang w:val="en-US"/>
         </w:rPr>
       </w:pPr>
-      <w:r>
-        <w:rPr>
-          <w:lang w:val="en-US"/>
-        </w:rPr>
-        <w:t>i) It reads from the identity topic and analyze the tokens will do matching and merging.</w:t>
+      <w:proofErr w:type="spellStart"/>
+      <w:r>
+        <w:rPr>
+          <w:lang w:val="en-US"/>
+        </w:rPr>
+        <w:t>i</w:t>
+      </w:r>
+      <w:proofErr w:type="spellEnd"/>
+      <w:r>
+        <w:rPr>
+          <w:lang w:val="en-US"/>
+        </w:rPr>
+        <w:t>) It reads from the identity topic and analyze the tokens will do matching and merging.</w:t>
       </w:r>
     </w:p>
     <w:p>
@@ -10663,7 +11215,21 @@
         <w:rPr>
           <w:lang w:val="en-US"/>
         </w:rPr>
-        <w:t>iii) Dynamodb rules will drive the decision tree logic.</w:t>
+        <w:t xml:space="preserve">iii) </w:t>
+      </w:r>
+      <w:proofErr w:type="spellStart"/>
+      <w:r>
+        <w:rPr>
+          <w:lang w:val="en-US"/>
+        </w:rPr>
+        <w:t>Dynamodb</w:t>
+      </w:r>
+      <w:proofErr w:type="spellEnd"/>
+      <w:r>
+        <w:rPr>
+          <w:lang w:val="en-US"/>
+        </w:rPr>
+        <w:t xml:space="preserve"> rules will drive the decision tree logic.</w:t>
       </w:r>
     </w:p>
     <w:p>
@@ -11282,7 +11848,35 @@
         <w:rPr>
           <w:lang w:val="en-US"/>
         </w:rPr>
-        <w:t xml:space="preserve">Why do we have the separate dynamodb database for rules ? and Why it has to be a NoSQL dynamodb ? Why can't we maintain the rules table in the </w:t>
+        <w:t xml:space="preserve">Why do we have the separate </w:t>
+      </w:r>
+      <w:proofErr w:type="spellStart"/>
+      <w:r>
+        <w:rPr>
+          <w:lang w:val="en-US"/>
+        </w:rPr>
+        <w:t>dynamodb</w:t>
+      </w:r>
+      <w:proofErr w:type="spellEnd"/>
+      <w:r>
+        <w:rPr>
+          <w:lang w:val="en-US"/>
+        </w:rPr>
+        <w:t xml:space="preserve"> database for rules ? and Why it has to be a NoSQL </w:t>
+      </w:r>
+      <w:proofErr w:type="spellStart"/>
+      <w:r>
+        <w:rPr>
+          <w:lang w:val="en-US"/>
+        </w:rPr>
+        <w:t>dynamodb</w:t>
+      </w:r>
+      <w:proofErr w:type="spellEnd"/>
+      <w:r>
+        <w:rPr>
+          <w:lang w:val="en-US"/>
+        </w:rPr>
+        <w:t xml:space="preserve"> ? Why can't we maintain the rules table in the </w:t>
       </w:r>
       <w:r>
         <w:rPr>
@@ -11434,7 +12028,7 @@
     </w:p>
     <w:p>
       <w:r>
-        <w:t>DynamoDB generally provides lower latency for simple key-based lookups</w:t>
+        <w:t>DynamoDB provides lower latency for simple key-based lookups</w:t>
       </w:r>
       <w:r>
         <w:t>.</w:t>
@@ -11490,7 +12084,15 @@
         <w:pStyle w:val="Heading2"/>
       </w:pPr>
       <w:r>
-        <w:t xml:space="preserve">Confluent kafka is not part of AWS </w:t>
+        <w:t xml:space="preserve">Confluent </w:t>
+      </w:r>
+      <w:proofErr w:type="spellStart"/>
+      <w:r>
+        <w:t>kafka</w:t>
+      </w:r>
+      <w:proofErr w:type="spellEnd"/>
+      <w:r>
+        <w:t xml:space="preserve"> is not part of AWS </w:t>
       </w:r>
       <w:r>
         <w:t>environment,</w:t>
@@ -11550,13 +12152,29 @@
         <w:pStyle w:val="Heading2"/>
       </w:pPr>
       <w:r>
-        <w:t xml:space="preserve">How does a lambda pull data from the kafka topic ( in this case the audit topic </w:t>
+        <w:t xml:space="preserve">How does a lambda pull data from the </w:t>
+      </w:r>
+      <w:proofErr w:type="spellStart"/>
+      <w:r>
+        <w:t>kafka</w:t>
+      </w:r>
+      <w:proofErr w:type="spellEnd"/>
+      <w:r>
+        <w:t xml:space="preserve"> topic ( in this case the audit topic </w:t>
       </w:r>
       <w:r>
         <w:t>data)</w:t>
       </w:r>
       <w:r>
-        <w:t xml:space="preserve"> ? does it have to poll continuously from the kafka </w:t>
+        <w:t xml:space="preserve"> ? does it have to poll continuously from the </w:t>
+      </w:r>
+      <w:proofErr w:type="spellStart"/>
+      <w:r>
+        <w:t>kafka</w:t>
+      </w:r>
+      <w:proofErr w:type="spellEnd"/>
+      <w:r>
+        <w:t xml:space="preserve"> </w:t>
       </w:r>
       <w:r>
         <w:t>topic?</w:t>
@@ -11687,20 +12305,21 @@
         <w:rPr>
           <w:lang w:eastAsia="en-IN"/>
         </w:rPr>
-        <w:t>public static final String SCHEDULE_CREATED = "ScheduleCreated";</w:t>
-      </w:r>
-    </w:p>
-    <w:p>
-      <w:pPr>
+        <w:t>public static final String SCHEDULE_CREATED = "</w:t>
+      </w:r>
+      <w:proofErr w:type="spellStart"/>
+      <w:r>
         <w:rPr>
           <w:lang w:eastAsia="en-IN"/>
         </w:rPr>
-      </w:pPr>
+        <w:t>ScheduleCreated</w:t>
+      </w:r>
+      <w:proofErr w:type="spellEnd"/>
       <w:r>
         <w:rPr>
           <w:lang w:eastAsia="en-IN"/>
         </w:rPr>
-        <w:t>public static final String CREW_ASSIGNED = "CrewAssigned";</w:t>
+        <w:t>";</w:t>
       </w:r>
     </w:p>
     <w:p>
@@ -11713,6 +12332,33 @@
         <w:rPr>
           <w:lang w:eastAsia="en-IN"/>
         </w:rPr>
+        <w:t>public static final String CREW_ASSIGNED = "</w:t>
+      </w:r>
+      <w:proofErr w:type="spellStart"/>
+      <w:r>
+        <w:rPr>
+          <w:lang w:eastAsia="en-IN"/>
+        </w:rPr>
+        <w:t>CrewAssigned</w:t>
+      </w:r>
+      <w:proofErr w:type="spellEnd"/>
+      <w:r>
+        <w:rPr>
+          <w:lang w:eastAsia="en-IN"/>
+        </w:rPr>
+        <w:t>";</w:t>
+      </w:r>
+    </w:p>
+    <w:p>
+      <w:pPr>
+        <w:rPr>
+          <w:lang w:eastAsia="en-IN"/>
+        </w:rPr>
+      </w:pPr>
+      <w:r>
+        <w:rPr>
+          <w:lang w:eastAsia="en-IN"/>
+        </w:rPr>
         <w:t>public static final int MAX_CONCURRENT_REQUESTS = 100;</w:t>
       </w:r>
     </w:p>
@@ -11726,7 +12372,21 @@
         <w:rPr>
           <w:lang w:eastAsia="en-IN"/>
         </w:rPr>
-        <w:t>public static final Duration CACHE_TTL = Duration.ofMinutes(30);</w:t>
+        <w:t xml:space="preserve">public static final Duration CACHE_TTL = </w:t>
+      </w:r>
+      <w:proofErr w:type="spellStart"/>
+      <w:r>
+        <w:rPr>
+          <w:lang w:eastAsia="en-IN"/>
+        </w:rPr>
+        <w:t>Duration.ofMinutes</w:t>
+      </w:r>
+      <w:proofErr w:type="spellEnd"/>
+      <w:r>
+        <w:rPr>
+          <w:lang w:eastAsia="en-IN"/>
+        </w:rPr>
+        <w:t>(30);</w:t>
       </w:r>
     </w:p>
     <w:p>
@@ -11747,7 +12407,15 @@
     </w:p>
     <w:p>
       <w:r>
-        <w:t>Used inheritance through JpaRepository for CRUD functionalit</w:t>
+        <w:t xml:space="preserve">Used inheritance through </w:t>
+      </w:r>
+      <w:proofErr w:type="spellStart"/>
+      <w:r>
+        <w:t>JpaRepository</w:t>
+      </w:r>
+      <w:proofErr w:type="spellEnd"/>
+      <w:r>
+        <w:t xml:space="preserve"> for CRUD functionalit</w:t>
       </w:r>
       <w:r>
         <w:t>ies.</w:t>
@@ -11768,59 +12436,55 @@
           <w:i/>
           <w:iCs/>
         </w:rPr>
-        <w:t>public interface AssignmentRepository</w:t>
-      </w:r>
+        <w:t xml:space="preserve">public interface </w:t>
+      </w:r>
+      <w:proofErr w:type="spellStart"/>
       <w:r>
         <w:rPr>
           <w:i/>
           <w:iCs/>
         </w:rPr>
-        <w:t xml:space="preserve"> </w:t>
-      </w:r>
+        <w:t>AssignmentRepository</w:t>
+      </w:r>
+      <w:proofErr w:type="spellEnd"/>
       <w:r>
         <w:rPr>
           <w:i/>
           <w:iCs/>
         </w:rPr>
-        <w:t>extends</w:t>
+        <w:t xml:space="preserve"> </w:t>
       </w:r>
       <w:r>
         <w:rPr>
           <w:i/>
           <w:iCs/>
         </w:rPr>
-        <w:t xml:space="preserve"> </w:t>
+        <w:t>extends</w:t>
       </w:r>
       <w:r>
         <w:rPr>
           <w:i/>
           <w:iCs/>
         </w:rPr>
-        <w:t>JpaRepository&lt;Assignment, Long&gt; {</w:t>
-      </w:r>
-    </w:p>
-    <w:p>
-      <w:pPr>
+        <w:t xml:space="preserve"> </w:t>
+      </w:r>
+      <w:proofErr w:type="spellStart"/>
+      <w:r>
         <w:rPr>
           <w:i/>
           <w:iCs/>
         </w:rPr>
-      </w:pPr>
+        <w:t>JpaRepository</w:t>
+      </w:r>
+      <w:proofErr w:type="spellEnd"/>
       <w:r>
         <w:rPr>
           <w:i/>
           <w:iCs/>
         </w:rPr>
-        <w:t>}</w:t>
-      </w:r>
-    </w:p>
-    <w:p/>
-    <w:p>
-      <w:r>
-        <w:t>Used inheritance to model different crew types such as Pilot, First Officer, and Cabin Crew while sharing common crew attributes in the parent CrewMember class.</w:t>
-      </w:r>
-    </w:p>
-    <w:p/>
+        <w:t>&lt;Assignment, Long&gt; {</w:t>
+      </w:r>
+    </w:p>
     <w:p>
       <w:pPr>
         <w:rPr>
@@ -11833,12 +12497,26 @@
           <w:i/>
           <w:iCs/>
         </w:rPr>
-        <w:t>public abstract class CrewMember {</w:t>
-      </w:r>
-    </w:p>
-    <w:p>
-      <w:pPr>
-        <w:ind w:left="720"/>
+        <w:t>}</w:t>
+      </w:r>
+    </w:p>
+    <w:p/>
+    <w:p>
+      <w:r>
+        <w:t xml:space="preserve">Used inheritance to model different crew types such as Pilot, First Officer, and Cabin Crew while sharing common crew attributes in the parent </w:t>
+      </w:r>
+      <w:proofErr w:type="spellStart"/>
+      <w:r>
+        <w:t>CrewMember</w:t>
+      </w:r>
+      <w:proofErr w:type="spellEnd"/>
+      <w:r>
+        <w:t xml:space="preserve"> class.</w:t>
+      </w:r>
+    </w:p>
+    <w:p/>
+    <w:p>
+      <w:pPr>
         <w:rPr>
           <w:i/>
           <w:iCs/>
@@ -11849,27 +12527,28 @@
           <w:i/>
           <w:iCs/>
         </w:rPr>
-        <w:t>private String crewId;</w:t>
-      </w:r>
-    </w:p>
-    <w:p>
-      <w:pPr>
-        <w:ind w:left="720"/>
+        <w:t xml:space="preserve">public abstract class </w:t>
+      </w:r>
+      <w:proofErr w:type="spellStart"/>
+      <w:r>
         <w:rPr>
           <w:i/>
           <w:iCs/>
         </w:rPr>
-      </w:pPr>
+        <w:t>CrewMember</w:t>
+      </w:r>
+      <w:proofErr w:type="spellEnd"/>
       <w:r>
         <w:rPr>
           <w:i/>
           <w:iCs/>
         </w:rPr>
-        <w:t>private String name;</w:t>
-      </w:r>
-    </w:p>
-    <w:p>
-      <w:pPr>
+        <w:t xml:space="preserve"> {</w:t>
+      </w:r>
+    </w:p>
+    <w:p>
+      <w:pPr>
+        <w:ind w:left="720"/>
         <w:rPr>
           <w:i/>
           <w:iCs/>
@@ -11880,98 +12559,64 @@
           <w:i/>
           <w:iCs/>
         </w:rPr>
-        <w:t>}</w:t>
-      </w:r>
-    </w:p>
-    <w:p>
-      <w:pPr>
+        <w:t xml:space="preserve">private String </w:t>
+      </w:r>
+      <w:proofErr w:type="spellStart"/>
+      <w:r>
         <w:rPr>
           <w:i/>
           <w:iCs/>
         </w:rPr>
-      </w:pPr>
-    </w:p>
-    <w:p>
-      <w:pPr>
+        <w:t>crewId</w:t>
+      </w:r>
+      <w:proofErr w:type="spellEnd"/>
+      <w:r>
         <w:rPr>
           <w:i/>
           <w:iCs/>
         </w:rPr>
-      </w:pPr>
-      <w:r>
+        <w:t>;</w:t>
+      </w:r>
+    </w:p>
+    <w:p>
+      <w:pPr>
+        <w:ind w:left="720"/>
         <w:rPr>
           <w:i/>
           <w:iCs/>
         </w:rPr>
-        <w:t>public class Pilot extends CrewMember {}</w:t>
-      </w:r>
-    </w:p>
-    <w:p>
-      <w:pPr>
+      </w:pPr>
+      <w:r>
         <w:rPr>
           <w:i/>
           <w:iCs/>
         </w:rPr>
-      </w:pPr>
-      <w:r>
+        <w:t>private String name;</w:t>
+      </w:r>
+    </w:p>
+    <w:p>
+      <w:pPr>
         <w:rPr>
           <w:i/>
           <w:iCs/>
         </w:rPr>
-        <w:t>public class FirstOfficer extends CrewMember {}</w:t>
-      </w:r>
-    </w:p>
-    <w:p>
-      <w:pPr>
+      </w:pPr>
+      <w:r>
         <w:rPr>
           <w:i/>
           <w:iCs/>
         </w:rPr>
-      </w:pPr>
-      <w:r>
+        <w:t>}</w:t>
+      </w:r>
+    </w:p>
+    <w:p>
+      <w:pPr>
         <w:rPr>
           <w:i/>
           <w:iCs/>
         </w:rPr>
-        <w:t>public class CabinCrew extends CrewMember {}</w:t>
-      </w:r>
-    </w:p>
-    <w:p/>
-    <w:p>
-      <w:pPr>
-        <w:pStyle w:val="Heading2"/>
-      </w:pPr>
-      <w:r>
-        <w:t>Singleton Pattern</w:t>
-      </w:r>
-    </w:p>
-    <w:p>
-      <w:r>
-        <w:t xml:space="preserve">Used the Singleton pattern </w:t>
-      </w:r>
-      <w:r>
-        <w:t>for all</w:t>
-      </w:r>
-      <w:r>
-        <w:t xml:space="preserve"> Spring-managed beans and logger instances</w:t>
-      </w:r>
-      <w:r>
-        <w:t xml:space="preserve"> </w:t>
-      </w:r>
-      <w:r>
-        <w:t xml:space="preserve">ensuring only one shared instance </w:t>
-      </w:r>
-      <w:r>
-        <w:t xml:space="preserve">per class </w:t>
-      </w:r>
-      <w:r>
-        <w:t>is used across the application lifecycle</w:t>
-      </w:r>
-      <w:r>
-        <w:t>.</w:t>
-      </w:r>
-    </w:p>
-    <w:p/>
+      </w:pPr>
+    </w:p>
     <w:p>
       <w:pPr>
         <w:rPr>
@@ -11984,22 +12629,117 @@
           <w:i/>
           <w:iCs/>
         </w:rPr>
-        <w:t>private static final Logger log =</w:t>
-      </w:r>
-    </w:p>
-    <w:p>
-      <w:pPr>
+        <w:t xml:space="preserve">public class Pilot extends </w:t>
+      </w:r>
+      <w:proofErr w:type="spellStart"/>
+      <w:r>
         <w:rPr>
           <w:i/>
           <w:iCs/>
         </w:rPr>
-      </w:pPr>
+        <w:t>CrewMember</w:t>
+      </w:r>
+      <w:proofErr w:type="spellEnd"/>
       <w:r>
         <w:rPr>
           <w:i/>
           <w:iCs/>
         </w:rPr>
-        <w:t>LoggerFactory.getLogger(CrewQueryService.class);</w:t>
+        <w:t xml:space="preserve"> {}</w:t>
+      </w:r>
+    </w:p>
+    <w:p>
+      <w:pPr>
+        <w:rPr>
+          <w:i/>
+          <w:iCs/>
+        </w:rPr>
+      </w:pPr>
+      <w:r>
+        <w:rPr>
+          <w:i/>
+          <w:iCs/>
+        </w:rPr>
+        <w:t xml:space="preserve">public class </w:t>
+      </w:r>
+      <w:proofErr w:type="spellStart"/>
+      <w:r>
+        <w:rPr>
+          <w:i/>
+          <w:iCs/>
+        </w:rPr>
+        <w:t>FirstOfficer</w:t>
+      </w:r>
+      <w:proofErr w:type="spellEnd"/>
+      <w:r>
+        <w:rPr>
+          <w:i/>
+          <w:iCs/>
+        </w:rPr>
+        <w:t xml:space="preserve"> extends </w:t>
+      </w:r>
+      <w:proofErr w:type="spellStart"/>
+      <w:r>
+        <w:rPr>
+          <w:i/>
+          <w:iCs/>
+        </w:rPr>
+        <w:t>CrewMember</w:t>
+      </w:r>
+      <w:proofErr w:type="spellEnd"/>
+      <w:r>
+        <w:rPr>
+          <w:i/>
+          <w:iCs/>
+        </w:rPr>
+        <w:t xml:space="preserve"> {}</w:t>
+      </w:r>
+    </w:p>
+    <w:p>
+      <w:pPr>
+        <w:rPr>
+          <w:i/>
+          <w:iCs/>
+        </w:rPr>
+      </w:pPr>
+      <w:r>
+        <w:rPr>
+          <w:i/>
+          <w:iCs/>
+        </w:rPr>
+        <w:t xml:space="preserve">public class </w:t>
+      </w:r>
+      <w:proofErr w:type="spellStart"/>
+      <w:r>
+        <w:rPr>
+          <w:i/>
+          <w:iCs/>
+        </w:rPr>
+        <w:t>CabinCrew</w:t>
+      </w:r>
+      <w:proofErr w:type="spellEnd"/>
+      <w:r>
+        <w:rPr>
+          <w:i/>
+          <w:iCs/>
+        </w:rPr>
+        <w:t xml:space="preserve"> extends </w:t>
+      </w:r>
+      <w:proofErr w:type="spellStart"/>
+      <w:r>
+        <w:rPr>
+          <w:i/>
+          <w:iCs/>
+        </w:rPr>
+        <w:t>CrewMember</w:t>
+      </w:r>
+      <w:proofErr w:type="spellEnd"/>
+      <w:r>
+        <w:rPr>
+          <w:i/>
+          <w:iCs/>
+        </w:rPr>
+        <w:t xml:space="preserve"> {}</w:t>
       </w:r>
     </w:p>
     <w:p/>
@@ -12008,170 +12748,1382 @@
         <w:pStyle w:val="Heading2"/>
       </w:pPr>
       <w:r>
+        <w:t>Singleton Pattern</w:t>
+      </w:r>
+    </w:p>
+    <w:p>
+      <w:r>
+        <w:t xml:space="preserve">Used the Singleton pattern </w:t>
+      </w:r>
+      <w:r>
+        <w:t>for all</w:t>
+      </w:r>
+      <w:r>
+        <w:t xml:space="preserve"> Spring-managed beans and logger instances</w:t>
+      </w:r>
+      <w:r>
+        <w:t xml:space="preserve"> </w:t>
+      </w:r>
+      <w:r>
+        <w:t xml:space="preserve">ensuring only one shared instance </w:t>
+      </w:r>
+      <w:r>
+        <w:t xml:space="preserve">per class </w:t>
+      </w:r>
+      <w:r>
+        <w:t>is used across the application lifecycle</w:t>
+      </w:r>
+      <w:r>
+        <w:t>.</w:t>
+      </w:r>
+    </w:p>
+    <w:p/>
+    <w:p>
+      <w:pPr>
+        <w:rPr>
+          <w:i/>
+          <w:iCs/>
+        </w:rPr>
+      </w:pPr>
+      <w:r>
+        <w:rPr>
+          <w:i/>
+          <w:iCs/>
+        </w:rPr>
+        <w:t>private static final Logger log =</w:t>
+      </w:r>
+    </w:p>
+    <w:p>
+      <w:pPr>
+        <w:rPr>
+          <w:i/>
+          <w:iCs/>
+        </w:rPr>
+      </w:pPr>
+      <w:proofErr w:type="spellStart"/>
+      <w:r>
+        <w:rPr>
+          <w:i/>
+          <w:iCs/>
+        </w:rPr>
+        <w:t>LoggerFactory.getLogger</w:t>
+      </w:r>
+      <w:proofErr w:type="spellEnd"/>
+      <w:r>
+        <w:rPr>
+          <w:i/>
+          <w:iCs/>
+        </w:rPr>
+        <w:t>(</w:t>
+      </w:r>
+      <w:proofErr w:type="spellStart"/>
+      <w:r>
+        <w:rPr>
+          <w:i/>
+          <w:iCs/>
+        </w:rPr>
+        <w:t>CrewQueryService.class</w:t>
+      </w:r>
+      <w:proofErr w:type="spellEnd"/>
+      <w:r>
+        <w:rPr>
+          <w:i/>
+          <w:iCs/>
+        </w:rPr>
+        <w:t>);</w:t>
+      </w:r>
+    </w:p>
+    <w:p/>
+    <w:p>
+      <w:pPr>
+        <w:rPr>
+          <w:i/>
+          <w:iCs/>
+        </w:rPr>
+      </w:pPr>
+    </w:p>
+    <w:p>
+      <w:r>
         <w:lastRenderedPageBreak/>
-        <w:t>Builder Pattern</w:t>
+        <w:t xml:space="preserve">Note : In this case </w:t>
+      </w:r>
+      <w:r>
+        <w:t xml:space="preserve">, </w:t>
+      </w:r>
+      <w:r>
+        <w:t>this involves the Factory design pattern as well</w:t>
+      </w:r>
+      <w:r>
+        <w:t xml:space="preserve"> like </w:t>
+      </w:r>
+    </w:p>
+    <w:p>
+      <w:proofErr w:type="spellStart"/>
+      <w:r>
+        <w:t>LoggerFactory</w:t>
+      </w:r>
+      <w:proofErr w:type="spellEnd"/>
+      <w:r>
+        <w:t xml:space="preserve"> decides which concrete logger implementation to return</w:t>
+      </w:r>
+      <w:r>
+        <w:t xml:space="preserve"> between </w:t>
+      </w:r>
+      <w:r>
+        <w:t>SLF4J</w:t>
+      </w:r>
+      <w:r>
+        <w:t xml:space="preserve"> </w:t>
+      </w:r>
+      <w:r>
+        <w:t xml:space="preserve">or </w:t>
+      </w:r>
+      <w:r>
+        <w:t xml:space="preserve">Log4j2 </w:t>
+      </w:r>
+      <w:r>
+        <w:t>etc.</w:t>
+      </w:r>
+    </w:p>
+    <w:p>
+      <w:pPr>
+        <w:rPr>
+          <w:u w:val="single"/>
+        </w:rPr>
+      </w:pPr>
+      <w:r>
+        <w:rPr>
+          <w:u w:val="single"/>
+        </w:rPr>
+        <w:t xml:space="preserve">Dynamo DB rules table loading </w:t>
+      </w:r>
+    </w:p>
+    <w:p>
+      <w:r>
+        <w:t>Since the rules table is relatively small and changes infrequently, a common approach is to load the entire rules configuration from DynamoDB into an in-memory cache during service startup. The cache can be implemented as a Singleton bean</w:t>
+      </w:r>
+      <w:r>
+        <w:t>.</w:t>
+      </w:r>
+    </w:p>
+    <w:p>
+      <w:r>
+        <w:t xml:space="preserve">So , that the entire application instance can </w:t>
+      </w:r>
+      <w:r>
+        <w:t xml:space="preserve">reuse </w:t>
+      </w:r>
+      <w:r>
+        <w:t xml:space="preserve">this </w:t>
+      </w:r>
+      <w:r>
+        <w:t xml:space="preserve">instead of querying DynamoDB for every </w:t>
+      </w:r>
+      <w:r>
+        <w:t>such request</w:t>
+      </w:r>
+      <w:r>
+        <w:t xml:space="preserve"> </w:t>
+      </w:r>
+      <w:r>
+        <w:t>, reducing latency and database load.</w:t>
+      </w:r>
+    </w:p>
+    <w:p>
+      <w:pPr>
+        <w:rPr>
+          <w:u w:val="single"/>
+        </w:rPr>
+      </w:pPr>
+    </w:p>
+    <w:p>
+      <w:pPr>
+        <w:pStyle w:val="Heading2"/>
+      </w:pPr>
+      <w:r>
+        <w:t>Strategy Pattern</w:t>
       </w:r>
     </w:p>
     <w:p/>
     <w:p>
-      <w:r>
-        <w:t>Used the Builder pattern to construct ErrorResponse and Kafka event objects with multiple optional fields while avoiding large constructors</w:t>
-      </w:r>
-      <w:r>
-        <w:t>.</w:t>
-      </w:r>
-    </w:p>
-    <w:p>
-      <w:pPr>
-        <w:rPr>
-          <w:lang w:val="en-US"/>
-        </w:rPr>
-      </w:pPr>
-    </w:p>
-    <w:p>
-      <w:pPr>
-        <w:rPr>
-          <w:lang w:val="en-US"/>
-        </w:rPr>
-      </w:pPr>
-    </w:p>
-    <w:p>
-      <w:pPr>
+      <w:pPr>
+        <w:rPr>
+          <w:u w:val="single"/>
+        </w:rPr>
+      </w:pPr>
+      <w:r>
+        <w:rPr>
+          <w:u w:val="single"/>
+        </w:rPr>
+        <w:t xml:space="preserve">In the </w:t>
+      </w:r>
+      <w:r>
+        <w:rPr>
+          <w:u w:val="single"/>
+        </w:rPr>
+        <w:t>project:</w:t>
+      </w:r>
+      <w:r>
+        <w:rPr>
+          <w:u w:val="single"/>
+        </w:rPr>
+        <w:t xml:space="preserve"> </w:t>
+      </w:r>
+    </w:p>
+    <w:p>
+      <w:r>
+        <w:t>Factory creates the appropriate validator object, and Strategy contains the validation algorithm for that token.</w:t>
+      </w:r>
+    </w:p>
+    <w:p/>
+    <w:p>
+      <w:r>
+        <w:t xml:space="preserve">Factory and Strategy patterns </w:t>
+      </w:r>
+      <w:r>
+        <w:t xml:space="preserve">are related, but they solve </w:t>
+      </w:r>
+      <w:r>
         <w:rPr>
           <w:b/>
           <w:bCs/>
         </w:rPr>
-      </w:pPr>
-      <w:r>
+        <w:t>different problems</w:t>
+      </w:r>
+      <w:r>
+        <w:t>.</w:t>
+      </w:r>
+    </w:p>
+    <w:p/>
+    <w:p>
+      <w:r>
+        <w:t>Which algorithm/business logic should I execute?</w:t>
+      </w:r>
+    </w:p>
+    <w:p>
+      <w:pPr>
         <w:rPr>
           <w:b/>
           <w:bCs/>
         </w:rPr>
-        <w:t>Error Response Object</w:t>
-      </w:r>
-    </w:p>
-    <w:p>
-      <w:r>
-        <w:t>ErrorResponse.builder()</w:t>
-      </w:r>
-    </w:p>
-    <w:p>
-      <w:r>
-        <w:t>.errorCode("CREW_001")</w:t>
-      </w:r>
-    </w:p>
-    <w:p>
-      <w:r>
-        <w:t>.message("Crew not qualified")</w:t>
-      </w:r>
-    </w:p>
-    <w:p>
-      <w:r>
-        <w:t>.correlationId(requestId)</w:t>
-      </w:r>
-    </w:p>
-    <w:p>
-      <w:r>
-        <w:t>.timestamp(Instant.now())</w:t>
-      </w:r>
-    </w:p>
-    <w:p>
-      <w:r>
-        <w:t>.build();</w:t>
-      </w:r>
-    </w:p>
-    <w:p/>
-    <w:p>
-      <w:pPr>
+      </w:pPr>
+      <w:r>
         <w:rPr>
           <w:b/>
           <w:bCs/>
         </w:rPr>
-      </w:pPr>
+        <w:t xml:space="preserve">Strategy Pattern = </w:t>
+      </w:r>
+      <w:proofErr w:type="spellStart"/>
       <w:r>
         <w:rPr>
           <w:b/>
           <w:bCs/>
         </w:rPr>
+        <w:t>Behavior</w:t>
+      </w:r>
+      <w:proofErr w:type="spellEnd"/>
+      <w:r>
+        <w:rPr>
+          <w:b/>
+          <w:bCs/>
+        </w:rPr>
+        <w:t>/Algorithm Selection</w:t>
+      </w:r>
+    </w:p>
+    <w:p/>
+    <w:p>
+      <w:pPr>
+        <w:rPr>
+          <w:u w:val="single"/>
+        </w:rPr>
+      </w:pPr>
+      <w:r>
+        <w:rPr>
+          <w:u w:val="single"/>
+        </w:rPr>
+        <w:t>Strategy Interface</w:t>
+      </w:r>
+    </w:p>
+    <w:p>
+      <w:pPr>
+        <w:rPr>
+          <w:color w:val="0070C0"/>
+        </w:rPr>
+      </w:pPr>
+      <w:r>
+        <w:rPr>
+          <w:color w:val="0070C0"/>
+        </w:rPr>
+        <w:t xml:space="preserve">public interface </w:t>
+      </w:r>
+      <w:proofErr w:type="spellStart"/>
+      <w:r>
+        <w:rPr>
+          <w:color w:val="0070C0"/>
+        </w:rPr>
+        <w:t>TokenValidator</w:t>
+      </w:r>
+      <w:proofErr w:type="spellEnd"/>
+      <w:r>
+        <w:rPr>
+          <w:color w:val="0070C0"/>
+        </w:rPr>
+        <w:t xml:space="preserve"> {</w:t>
+      </w:r>
+    </w:p>
+    <w:p>
+      <w:pPr>
+        <w:rPr>
+          <w:color w:val="0070C0"/>
+        </w:rPr>
+      </w:pPr>
+      <w:proofErr w:type="spellStart"/>
+      <w:r>
+        <w:rPr>
+          <w:color w:val="0070C0"/>
+        </w:rPr>
+        <w:t>boolean</w:t>
+      </w:r>
+      <w:proofErr w:type="spellEnd"/>
+      <w:r>
+        <w:rPr>
+          <w:color w:val="0070C0"/>
+        </w:rPr>
+        <w:t xml:space="preserve"> validate(String value);</w:t>
+      </w:r>
+    </w:p>
+    <w:p>
+      <w:pPr>
+        <w:rPr>
+          <w:color w:val="0070C0"/>
+        </w:rPr>
+      </w:pPr>
+      <w:r>
+        <w:rPr>
+          <w:color w:val="0070C0"/>
+        </w:rPr>
+        <w:t>}</w:t>
+      </w:r>
+    </w:p>
+    <w:p>
+      <w:pPr>
+        <w:rPr>
+          <w:u w:val="single"/>
+        </w:rPr>
+      </w:pPr>
+      <w:r>
+        <w:rPr>
+          <w:u w:val="single"/>
+        </w:rPr>
+        <w:t xml:space="preserve">Concrete Strategies </w:t>
+      </w:r>
+    </w:p>
+    <w:p>
+      <w:proofErr w:type="spellStart"/>
+      <w:r>
+        <w:t>EmailValidator</w:t>
+      </w:r>
+      <w:proofErr w:type="spellEnd"/>
+    </w:p>
+    <w:p>
+      <w:pPr>
+        <w:rPr>
+          <w:color w:val="0070C0"/>
+        </w:rPr>
+      </w:pPr>
+      <w:r>
+        <w:rPr>
+          <w:color w:val="0070C0"/>
+        </w:rPr>
+        <w:t xml:space="preserve">public class </w:t>
+      </w:r>
+      <w:proofErr w:type="spellStart"/>
+      <w:r>
+        <w:rPr>
+          <w:color w:val="0070C0"/>
+        </w:rPr>
+        <w:t>EmailValidator</w:t>
+      </w:r>
+      <w:proofErr w:type="spellEnd"/>
+      <w:r>
+        <w:rPr>
+          <w:color w:val="0070C0"/>
+        </w:rPr>
+        <w:t xml:space="preserve"> implements </w:t>
+      </w:r>
+      <w:proofErr w:type="spellStart"/>
+      <w:r>
+        <w:rPr>
+          <w:color w:val="0070C0"/>
+        </w:rPr>
+        <w:t>TokenValidator</w:t>
+      </w:r>
+      <w:proofErr w:type="spellEnd"/>
+      <w:r>
+        <w:rPr>
+          <w:color w:val="0070C0"/>
+        </w:rPr>
+        <w:t xml:space="preserve"> {</w:t>
+      </w:r>
+    </w:p>
+    <w:p>
+      <w:pPr>
+        <w:rPr>
+          <w:color w:val="0070C0"/>
+        </w:rPr>
+      </w:pPr>
+      <w:r>
+        <w:rPr>
+          <w:color w:val="0070C0"/>
+        </w:rPr>
+        <w:t>@Override</w:t>
+      </w:r>
+    </w:p>
+    <w:p>
+      <w:pPr>
+        <w:rPr>
+          <w:color w:val="0070C0"/>
+        </w:rPr>
+      </w:pPr>
+      <w:r>
+        <w:rPr>
+          <w:color w:val="0070C0"/>
+        </w:rPr>
+        <w:lastRenderedPageBreak/>
+        <w:t xml:space="preserve">public </w:t>
+      </w:r>
+      <w:proofErr w:type="spellStart"/>
+      <w:r>
+        <w:rPr>
+          <w:color w:val="0070C0"/>
+        </w:rPr>
+        <w:t>boolean</w:t>
+      </w:r>
+      <w:proofErr w:type="spellEnd"/>
+      <w:r>
+        <w:rPr>
+          <w:color w:val="0070C0"/>
+        </w:rPr>
+        <w:t xml:space="preserve"> validate(String email) {</w:t>
+      </w:r>
+    </w:p>
+    <w:p>
+      <w:pPr>
+        <w:rPr>
+          <w:color w:val="0070C0"/>
+        </w:rPr>
+      </w:pPr>
+      <w:r>
+        <w:rPr>
+          <w:color w:val="0070C0"/>
+        </w:rPr>
+        <w:t xml:space="preserve">return </w:t>
+      </w:r>
+      <w:proofErr w:type="spellStart"/>
+      <w:r>
+        <w:rPr>
+          <w:color w:val="0070C0"/>
+        </w:rPr>
+        <w:t>email.contains</w:t>
+      </w:r>
+      <w:proofErr w:type="spellEnd"/>
+      <w:r>
+        <w:rPr>
+          <w:color w:val="0070C0"/>
+        </w:rPr>
+        <w:t>("@");</w:t>
+      </w:r>
+    </w:p>
+    <w:p>
+      <w:pPr>
+        <w:rPr>
+          <w:color w:val="0070C0"/>
+        </w:rPr>
+      </w:pPr>
+      <w:r>
+        <w:rPr>
+          <w:color w:val="0070C0"/>
+        </w:rPr>
+        <w:t>}</w:t>
+      </w:r>
+    </w:p>
+    <w:p>
+      <w:pPr>
+        <w:rPr>
+          <w:color w:val="0070C0"/>
+        </w:rPr>
+      </w:pPr>
+      <w:r>
+        <w:rPr>
+          <w:color w:val="0070C0"/>
+        </w:rPr>
+        <w:t>}</w:t>
+      </w:r>
+    </w:p>
+    <w:p>
+      <w:proofErr w:type="spellStart"/>
+      <w:r>
+        <w:t>PhoneValidator</w:t>
+      </w:r>
+      <w:proofErr w:type="spellEnd"/>
+    </w:p>
+    <w:p/>
+    <w:p>
+      <w:pPr>
+        <w:rPr>
+          <w:color w:val="0070C0"/>
+        </w:rPr>
+      </w:pPr>
+      <w:r>
+        <w:rPr>
+          <w:color w:val="0070C0"/>
+        </w:rPr>
+        <w:t xml:space="preserve">public class </w:t>
+      </w:r>
+      <w:proofErr w:type="spellStart"/>
+      <w:r>
+        <w:rPr>
+          <w:color w:val="0070C0"/>
+        </w:rPr>
+        <w:t>PhoneValidator</w:t>
+      </w:r>
+      <w:proofErr w:type="spellEnd"/>
+      <w:r>
+        <w:rPr>
+          <w:color w:val="0070C0"/>
+        </w:rPr>
+        <w:t xml:space="preserve"> implements </w:t>
+      </w:r>
+      <w:proofErr w:type="spellStart"/>
+      <w:r>
+        <w:rPr>
+          <w:color w:val="0070C0"/>
+        </w:rPr>
+        <w:t>TokenValidator</w:t>
+      </w:r>
+      <w:proofErr w:type="spellEnd"/>
+      <w:r>
+        <w:rPr>
+          <w:color w:val="0070C0"/>
+        </w:rPr>
+        <w:t xml:space="preserve"> {</w:t>
+      </w:r>
+    </w:p>
+    <w:p>
+      <w:pPr>
+        <w:rPr>
+          <w:color w:val="0070C0"/>
+        </w:rPr>
+      </w:pPr>
+    </w:p>
+    <w:p>
+      <w:pPr>
+        <w:rPr>
+          <w:color w:val="0070C0"/>
+        </w:rPr>
+      </w:pPr>
+      <w:r>
+        <w:rPr>
+          <w:color w:val="0070C0"/>
+        </w:rPr>
+        <w:t>@Override</w:t>
+      </w:r>
+    </w:p>
+    <w:p>
+      <w:pPr>
+        <w:rPr>
+          <w:color w:val="0070C0"/>
+        </w:rPr>
+      </w:pPr>
+      <w:r>
+        <w:rPr>
+          <w:color w:val="0070C0"/>
+        </w:rPr>
+        <w:t xml:space="preserve">public </w:t>
+      </w:r>
+      <w:proofErr w:type="spellStart"/>
+      <w:r>
+        <w:rPr>
+          <w:color w:val="0070C0"/>
+        </w:rPr>
+        <w:t>boolean</w:t>
+      </w:r>
+      <w:proofErr w:type="spellEnd"/>
+      <w:r>
+        <w:rPr>
+          <w:color w:val="0070C0"/>
+        </w:rPr>
+        <w:t xml:space="preserve"> validate(String phone) {</w:t>
+      </w:r>
+    </w:p>
+    <w:p>
+      <w:pPr>
+        <w:rPr>
+          <w:color w:val="0070C0"/>
+        </w:rPr>
+      </w:pPr>
+      <w:r>
+        <w:rPr>
+          <w:color w:val="0070C0"/>
+        </w:rPr>
+        <w:t xml:space="preserve">return </w:t>
+      </w:r>
+      <w:proofErr w:type="spellStart"/>
+      <w:r>
+        <w:rPr>
+          <w:color w:val="0070C0"/>
+        </w:rPr>
+        <w:t>phone.matches</w:t>
+      </w:r>
+      <w:proofErr w:type="spellEnd"/>
+      <w:r>
+        <w:rPr>
+          <w:color w:val="0070C0"/>
+        </w:rPr>
+        <w:t>("\\d{10}");</w:t>
+      </w:r>
+    </w:p>
+    <w:p>
+      <w:pPr>
+        <w:rPr>
+          <w:color w:val="0070C0"/>
+        </w:rPr>
+      </w:pPr>
+      <w:r>
+        <w:rPr>
+          <w:color w:val="0070C0"/>
+        </w:rPr>
+        <w:t>}</w:t>
+      </w:r>
+    </w:p>
+    <w:p>
+      <w:pPr>
+        <w:rPr>
+          <w:color w:val="0070C0"/>
+        </w:rPr>
+      </w:pPr>
+      <w:r>
+        <w:rPr>
+          <w:color w:val="0070C0"/>
+        </w:rPr>
+        <w:t>}</w:t>
+      </w:r>
+    </w:p>
+    <w:p/>
+    <w:p>
+      <w:pPr>
+        <w:pStyle w:val="Heading2"/>
+      </w:pPr>
+      <w:r>
+        <w:t>Factory Patter</w:t>
+      </w:r>
+      <w:r>
+        <w:t>n</w:t>
+      </w:r>
+    </w:p>
+    <w:p/>
+    <w:p>
+      <w:r>
+        <w:t xml:space="preserve">Which object should I </w:t>
+      </w:r>
+      <w:r>
+        <w:t>create</w:t>
+      </w:r>
+      <w:r>
+        <w:t>?</w:t>
+      </w:r>
+    </w:p>
+    <w:p>
+      <w:pPr>
+        <w:rPr>
+          <w:b/>
+          <w:bCs/>
+        </w:rPr>
+      </w:pPr>
+      <w:r>
+        <w:rPr>
+          <w:b/>
+          <w:bCs/>
+        </w:rPr>
+        <w:t>Factory Pattern = Object Creation</w:t>
+      </w:r>
+    </w:p>
+    <w:p/>
+    <w:p>
+      <w:pPr>
+        <w:rPr>
+          <w:color w:val="0070C0"/>
+        </w:rPr>
+      </w:pPr>
+      <w:r>
+        <w:rPr>
+          <w:color w:val="0070C0"/>
+        </w:rPr>
+        <w:t xml:space="preserve">public class </w:t>
+      </w:r>
+      <w:proofErr w:type="spellStart"/>
+      <w:r>
+        <w:rPr>
+          <w:color w:val="0070C0"/>
+        </w:rPr>
+        <w:t>TokenValidatorFactory</w:t>
+      </w:r>
+      <w:proofErr w:type="spellEnd"/>
+      <w:r>
+        <w:rPr>
+          <w:color w:val="0070C0"/>
+        </w:rPr>
+        <w:t xml:space="preserve"> {</w:t>
+      </w:r>
+    </w:p>
+    <w:p>
+      <w:pPr>
+        <w:rPr>
+          <w:color w:val="0070C0"/>
+        </w:rPr>
+      </w:pPr>
+    </w:p>
+    <w:p>
+      <w:pPr>
+        <w:rPr>
+          <w:color w:val="0070C0"/>
+        </w:rPr>
+      </w:pPr>
+      <w:r>
+        <w:rPr>
+          <w:color w:val="0070C0"/>
+        </w:rPr>
+        <w:t xml:space="preserve">public static </w:t>
+      </w:r>
+      <w:proofErr w:type="spellStart"/>
+      <w:r>
+        <w:rPr>
+          <w:color w:val="0070C0"/>
+        </w:rPr>
+        <w:t>TokenValidator</w:t>
+      </w:r>
+      <w:proofErr w:type="spellEnd"/>
+      <w:r>
+        <w:rPr>
+          <w:color w:val="0070C0"/>
+        </w:rPr>
+        <w:t xml:space="preserve"> </w:t>
+      </w:r>
+      <w:proofErr w:type="spellStart"/>
+      <w:r>
+        <w:rPr>
+          <w:color w:val="0070C0"/>
+        </w:rPr>
+        <w:t>getValidator</w:t>
+      </w:r>
+      <w:proofErr w:type="spellEnd"/>
+      <w:r>
+        <w:rPr>
+          <w:color w:val="0070C0"/>
+        </w:rPr>
+        <w:t>(</w:t>
+      </w:r>
+    </w:p>
+    <w:p>
+      <w:pPr>
+        <w:rPr>
+          <w:color w:val="0070C0"/>
+        </w:rPr>
+      </w:pPr>
+      <w:proofErr w:type="spellStart"/>
+      <w:r>
+        <w:rPr>
+          <w:color w:val="0070C0"/>
+        </w:rPr>
+        <w:t>TokenType</w:t>
+      </w:r>
+      <w:proofErr w:type="spellEnd"/>
+      <w:r>
+        <w:rPr>
+          <w:color w:val="0070C0"/>
+        </w:rPr>
+        <w:t xml:space="preserve"> </w:t>
+      </w:r>
+      <w:proofErr w:type="spellStart"/>
+      <w:r>
+        <w:rPr>
+          <w:color w:val="0070C0"/>
+        </w:rPr>
+        <w:t>tokenType</w:t>
+      </w:r>
+      <w:proofErr w:type="spellEnd"/>
+      <w:r>
+        <w:rPr>
+          <w:color w:val="0070C0"/>
+        </w:rPr>
+        <w:t>) {</w:t>
+      </w:r>
+    </w:p>
+    <w:p>
+      <w:pPr>
+        <w:rPr>
+          <w:color w:val="0070C0"/>
+        </w:rPr>
+      </w:pPr>
+    </w:p>
+    <w:p>
+      <w:pPr>
+        <w:rPr>
+          <w:color w:val="0070C0"/>
+        </w:rPr>
+      </w:pPr>
+      <w:r>
+        <w:rPr>
+          <w:color w:val="0070C0"/>
+        </w:rPr>
+        <w:t>switch(</w:t>
+      </w:r>
+      <w:proofErr w:type="spellStart"/>
+      <w:r>
+        <w:rPr>
+          <w:color w:val="0070C0"/>
+        </w:rPr>
+        <w:t>tokenType</w:t>
+      </w:r>
+      <w:proofErr w:type="spellEnd"/>
+      <w:r>
+        <w:rPr>
+          <w:color w:val="0070C0"/>
+        </w:rPr>
+        <w:t>) {</w:t>
+      </w:r>
+    </w:p>
+    <w:p>
+      <w:pPr>
+        <w:rPr>
+          <w:color w:val="0070C0"/>
+        </w:rPr>
+      </w:pPr>
+    </w:p>
+    <w:p>
+      <w:pPr>
+        <w:rPr>
+          <w:color w:val="0070C0"/>
+        </w:rPr>
+      </w:pPr>
+      <w:r>
+        <w:rPr>
+          <w:color w:val="0070C0"/>
+        </w:rPr>
+        <w:t>case EMAIL:</w:t>
+      </w:r>
+    </w:p>
+    <w:p>
+      <w:pPr>
+        <w:rPr>
+          <w:color w:val="0070C0"/>
+        </w:rPr>
+      </w:pPr>
+      <w:r>
+        <w:rPr>
+          <w:color w:val="0070C0"/>
+        </w:rPr>
+        <w:t xml:space="preserve">return new </w:t>
+      </w:r>
+      <w:proofErr w:type="spellStart"/>
+      <w:r>
+        <w:rPr>
+          <w:color w:val="0070C0"/>
+        </w:rPr>
+        <w:t>EmailValidator</w:t>
+      </w:r>
+      <w:proofErr w:type="spellEnd"/>
+      <w:r>
+        <w:rPr>
+          <w:color w:val="0070C0"/>
+        </w:rPr>
+        <w:t>();</w:t>
+      </w:r>
+    </w:p>
+    <w:p>
+      <w:pPr>
+        <w:rPr>
+          <w:color w:val="0070C0"/>
+        </w:rPr>
+      </w:pPr>
+    </w:p>
+    <w:p>
+      <w:pPr>
+        <w:rPr>
+          <w:color w:val="0070C0"/>
+        </w:rPr>
+      </w:pPr>
+      <w:r>
+        <w:rPr>
+          <w:color w:val="0070C0"/>
+        </w:rPr>
+        <w:lastRenderedPageBreak/>
+        <w:t>case PHONE:</w:t>
+      </w:r>
+    </w:p>
+    <w:p>
+      <w:pPr>
+        <w:rPr>
+          <w:color w:val="0070C0"/>
+        </w:rPr>
+      </w:pPr>
+      <w:r>
+        <w:rPr>
+          <w:color w:val="0070C0"/>
+        </w:rPr>
+        <w:t xml:space="preserve">return new </w:t>
+      </w:r>
+      <w:proofErr w:type="spellStart"/>
+      <w:r>
+        <w:rPr>
+          <w:color w:val="0070C0"/>
+        </w:rPr>
+        <w:t>PhoneValidator</w:t>
+      </w:r>
+      <w:proofErr w:type="spellEnd"/>
+      <w:r>
+        <w:rPr>
+          <w:color w:val="0070C0"/>
+        </w:rPr>
+        <w:t>();</w:t>
+      </w:r>
+    </w:p>
+    <w:p>
+      <w:pPr>
+        <w:rPr>
+          <w:color w:val="0070C0"/>
+        </w:rPr>
+      </w:pPr>
+    </w:p>
+    <w:p>
+      <w:pPr>
+        <w:rPr>
+          <w:color w:val="0070C0"/>
+        </w:rPr>
+      </w:pPr>
+    </w:p>
+    <w:p>
+      <w:pPr>
+        <w:rPr>
+          <w:color w:val="0070C0"/>
+        </w:rPr>
+      </w:pPr>
+      <w:r>
+        <w:rPr>
+          <w:color w:val="0070C0"/>
+        </w:rPr>
+        <w:t>default:</w:t>
+      </w:r>
+    </w:p>
+    <w:p>
+      <w:pPr>
+        <w:rPr>
+          <w:color w:val="0070C0"/>
+        </w:rPr>
+      </w:pPr>
+      <w:r>
+        <w:rPr>
+          <w:color w:val="0070C0"/>
+        </w:rPr>
+        <w:t xml:space="preserve">throw new </w:t>
+      </w:r>
+      <w:proofErr w:type="spellStart"/>
+      <w:r>
+        <w:rPr>
+          <w:color w:val="0070C0"/>
+        </w:rPr>
+        <w:t>IllegalArgumentException</w:t>
+      </w:r>
+      <w:proofErr w:type="spellEnd"/>
+      <w:r>
+        <w:rPr>
+          <w:color w:val="0070C0"/>
+        </w:rPr>
+        <w:t>(</w:t>
+      </w:r>
+    </w:p>
+    <w:p>
+      <w:pPr>
+        <w:rPr>
+          <w:color w:val="0070C0"/>
+        </w:rPr>
+      </w:pPr>
+      <w:r>
+        <w:rPr>
+          <w:color w:val="0070C0"/>
+        </w:rPr>
+        <w:t>"Unsupported token");</w:t>
+      </w:r>
+    </w:p>
+    <w:p>
+      <w:pPr>
+        <w:rPr>
+          <w:color w:val="0070C0"/>
+        </w:rPr>
+      </w:pPr>
+      <w:r>
+        <w:rPr>
+          <w:color w:val="0070C0"/>
+        </w:rPr>
+        <w:t>}</w:t>
+      </w:r>
+    </w:p>
+    <w:p>
+      <w:pPr>
+        <w:rPr>
+          <w:color w:val="0070C0"/>
+        </w:rPr>
+      </w:pPr>
+      <w:r>
+        <w:rPr>
+          <w:color w:val="0070C0"/>
+        </w:rPr>
+        <w:t>}</w:t>
+      </w:r>
+    </w:p>
+    <w:p>
+      <w:pPr>
+        <w:rPr>
+          <w:color w:val="0070C0"/>
+        </w:rPr>
+      </w:pPr>
+      <w:r>
+        <w:rPr>
+          <w:color w:val="0070C0"/>
+        </w:rPr>
+        <w:t>}</w:t>
+      </w:r>
+    </w:p>
+    <w:p/>
+    <w:p>
+      <w:r>
+        <w:t xml:space="preserve">// In the service </w:t>
+      </w:r>
+    </w:p>
+    <w:p>
+      <w:pPr>
+        <w:rPr>
+          <w:color w:val="0070C0"/>
+        </w:rPr>
+      </w:pPr>
+      <w:proofErr w:type="spellStart"/>
+      <w:r>
+        <w:rPr>
+          <w:color w:val="0070C0"/>
+        </w:rPr>
+        <w:t>TokenValidator</w:t>
+      </w:r>
+      <w:proofErr w:type="spellEnd"/>
+      <w:r>
+        <w:rPr>
+          <w:color w:val="0070C0"/>
+        </w:rPr>
+        <w:t xml:space="preserve"> validator =</w:t>
+      </w:r>
+    </w:p>
+    <w:p>
+      <w:pPr>
+        <w:rPr>
+          <w:color w:val="0070C0"/>
+        </w:rPr>
+      </w:pPr>
+      <w:proofErr w:type="spellStart"/>
+      <w:r>
+        <w:rPr>
+          <w:color w:val="0070C0"/>
+        </w:rPr>
+        <w:t>TokenValidatorFactory.getValidator</w:t>
+      </w:r>
+      <w:proofErr w:type="spellEnd"/>
+      <w:r>
+        <w:rPr>
+          <w:color w:val="0070C0"/>
+        </w:rPr>
+        <w:t>(</w:t>
+      </w:r>
+      <w:proofErr w:type="spellStart"/>
+      <w:r>
+        <w:rPr>
+          <w:color w:val="0070C0"/>
+        </w:rPr>
+        <w:t>tokenType</w:t>
+      </w:r>
+      <w:proofErr w:type="spellEnd"/>
+      <w:r>
+        <w:rPr>
+          <w:color w:val="0070C0"/>
+        </w:rPr>
+        <w:t>);</w:t>
+      </w:r>
+    </w:p>
+    <w:p>
+      <w:pPr>
+        <w:rPr>
+          <w:color w:val="0070C0"/>
+        </w:rPr>
+      </w:pPr>
+    </w:p>
+    <w:p>
+      <w:pPr>
+        <w:rPr>
+          <w:color w:val="0070C0"/>
+        </w:rPr>
+      </w:pPr>
+      <w:proofErr w:type="spellStart"/>
+      <w:r>
+        <w:rPr>
+          <w:color w:val="0070C0"/>
+        </w:rPr>
+        <w:t>boolean</w:t>
+      </w:r>
+      <w:proofErr w:type="spellEnd"/>
+      <w:r>
+        <w:rPr>
+          <w:color w:val="0070C0"/>
+        </w:rPr>
+        <w:t xml:space="preserve"> valid =</w:t>
+      </w:r>
+    </w:p>
+    <w:p>
+      <w:pPr>
+        <w:rPr>
+          <w:color w:val="0070C0"/>
+        </w:rPr>
+      </w:pPr>
+      <w:proofErr w:type="spellStart"/>
+      <w:r>
+        <w:rPr>
+          <w:color w:val="0070C0"/>
+        </w:rPr>
+        <w:t>validator.validate</w:t>
+      </w:r>
+      <w:proofErr w:type="spellEnd"/>
+      <w:r>
+        <w:rPr>
+          <w:color w:val="0070C0"/>
+        </w:rPr>
+        <w:t>(</w:t>
+      </w:r>
+      <w:proofErr w:type="spellStart"/>
+      <w:r>
+        <w:rPr>
+          <w:color w:val="0070C0"/>
+        </w:rPr>
+        <w:t>tokenValue</w:t>
+      </w:r>
+      <w:proofErr w:type="spellEnd"/>
+      <w:r>
+        <w:rPr>
+          <w:color w:val="0070C0"/>
+        </w:rPr>
+        <w:t>);</w:t>
+      </w:r>
+    </w:p>
+    <w:p/>
+    <w:p>
+      <w:pPr>
+        <w:pStyle w:val="Heading2"/>
+      </w:pPr>
+      <w:r>
+        <w:t>Builder Pattern</w:t>
+      </w:r>
+    </w:p>
+    <w:p/>
+    <w:p>
+      <w:r>
+        <w:t xml:space="preserve">Used the Builder pattern to construct </w:t>
+      </w:r>
+      <w:proofErr w:type="spellStart"/>
+      <w:r>
+        <w:t>ErrorResponse</w:t>
+      </w:r>
+      <w:proofErr w:type="spellEnd"/>
+      <w:r>
+        <w:t xml:space="preserve"> and Kafka event objects with multiple optional fields while avoiding large constructors</w:t>
+      </w:r>
+      <w:r>
+        <w:t>.</w:t>
+      </w:r>
+    </w:p>
+    <w:p>
+      <w:pPr>
+        <w:rPr>
+          <w:lang w:val="en-US"/>
+        </w:rPr>
+      </w:pPr>
+    </w:p>
+    <w:p>
+      <w:pPr>
+        <w:rPr>
+          <w:lang w:val="en-US"/>
+        </w:rPr>
+      </w:pPr>
+    </w:p>
+    <w:p>
+      <w:pPr>
+        <w:rPr>
+          <w:b/>
+          <w:bCs/>
+        </w:rPr>
+      </w:pPr>
+      <w:r>
+        <w:rPr>
+          <w:b/>
+          <w:bCs/>
+        </w:rPr>
+        <w:t>Error Response Object</w:t>
+      </w:r>
+    </w:p>
+    <w:p>
+      <w:proofErr w:type="spellStart"/>
+      <w:r>
+        <w:t>ErrorResponse.builder</w:t>
+      </w:r>
+      <w:proofErr w:type="spellEnd"/>
+      <w:r>
+        <w:t>()</w:t>
+      </w:r>
+    </w:p>
+    <w:p>
+      <w:r>
+        <w:t>.</w:t>
+      </w:r>
+      <w:proofErr w:type="spellStart"/>
+      <w:r>
+        <w:t>errorCode</w:t>
+      </w:r>
+      <w:proofErr w:type="spellEnd"/>
+      <w:r>
+        <w:t>("CREW_001")</w:t>
+      </w:r>
+    </w:p>
+    <w:p>
+      <w:r>
+        <w:t>.message("Crew not qualified")</w:t>
+      </w:r>
+    </w:p>
+    <w:p>
+      <w:r>
+        <w:t>.</w:t>
+      </w:r>
+      <w:proofErr w:type="spellStart"/>
+      <w:r>
+        <w:t>correlationId</w:t>
+      </w:r>
+      <w:proofErr w:type="spellEnd"/>
+      <w:r>
+        <w:t>(</w:t>
+      </w:r>
+      <w:proofErr w:type="spellStart"/>
+      <w:r>
+        <w:t>requestId</w:t>
+      </w:r>
+      <w:proofErr w:type="spellEnd"/>
+      <w:r>
+        <w:t>)</w:t>
+      </w:r>
+    </w:p>
+    <w:p>
+      <w:r>
+        <w:lastRenderedPageBreak/>
+        <w:t>.timestamp(</w:t>
+      </w:r>
+      <w:proofErr w:type="spellStart"/>
+      <w:r>
+        <w:t>Instant.now</w:t>
+      </w:r>
+      <w:proofErr w:type="spellEnd"/>
+      <w:r>
+        <w:t>())</w:t>
+      </w:r>
+    </w:p>
+    <w:p>
+      <w:r>
+        <w:t>.build();</w:t>
+      </w:r>
+    </w:p>
+    <w:p/>
+    <w:p>
+      <w:pPr>
+        <w:rPr>
+          <w:b/>
+          <w:bCs/>
+        </w:rPr>
+      </w:pPr>
+      <w:r>
+        <w:rPr>
+          <w:b/>
+          <w:bCs/>
+        </w:rPr>
         <w:t>Schedule Event</w:t>
       </w:r>
     </w:p>
     <w:p>
-      <w:r>
-        <w:t>CrewAssignedEvent.builder()</w:t>
-      </w:r>
-    </w:p>
-    <w:p>
-      <w:r>
-        <w:t>.crewId("CREW001")</w:t>
-      </w:r>
-    </w:p>
-    <w:p>
-      <w:r>
-        <w:t>.flightId("WN123")</w:t>
-      </w:r>
-    </w:p>
-    <w:p>
-      <w:r>
-        <w:t>.eventType("CrewAssigned")</w:t>
+      <w:proofErr w:type="spellStart"/>
+      <w:r>
+        <w:t>CrewAssignedEvent.builder</w:t>
+      </w:r>
+      <w:proofErr w:type="spellEnd"/>
+      <w:r>
+        <w:t>()</w:t>
+      </w:r>
+    </w:p>
+    <w:p>
+      <w:r>
+        <w:t>.</w:t>
+      </w:r>
+      <w:proofErr w:type="spellStart"/>
+      <w:r>
+        <w:t>crewId</w:t>
+      </w:r>
+      <w:proofErr w:type="spellEnd"/>
+      <w:r>
+        <w:t>("CREW001")</w:t>
+      </w:r>
+    </w:p>
+    <w:p>
+      <w:r>
+        <w:t>.</w:t>
+      </w:r>
+      <w:proofErr w:type="spellStart"/>
+      <w:r>
+        <w:t>flightId</w:t>
+      </w:r>
+      <w:proofErr w:type="spellEnd"/>
+      <w:r>
+        <w:t>("WN123")</w:t>
+      </w:r>
+    </w:p>
+    <w:p>
+      <w:r>
+        <w:t>.</w:t>
+      </w:r>
+      <w:proofErr w:type="spellStart"/>
+      <w:r>
+        <w:t>eventType</w:t>
+      </w:r>
+      <w:proofErr w:type="spellEnd"/>
+      <w:r>
+        <w:t>("</w:t>
+      </w:r>
+      <w:proofErr w:type="spellStart"/>
+      <w:r>
+        <w:t>CrewAssigned</w:t>
+      </w:r>
+      <w:proofErr w:type="spellEnd"/>
+      <w:r>
+        <w:t>")</w:t>
       </w:r>
     </w:p>
     <w:p>
       <w:r>
         <w:t>.build();</w:t>
-      </w:r>
-    </w:p>
-    <w:p/>
-    <w:p>
-      <w:pPr>
-        <w:pStyle w:val="Heading2"/>
-      </w:pPr>
-      <w:r>
-        <w:t>Strategy Pattern</w:t>
-      </w:r>
-    </w:p>
-    <w:p/>
-    <w:p>
-      <w:r>
-        <w:t>Used the Strategy pattern in the Crew Validation Service to apply different validation algorithms such as Rest Period, Flight Hours, Medical, and Qualification checks through a common interface.</w:t>
-      </w:r>
-    </w:p>
-    <w:p/>
-    <w:p>
-      <w:r>
-        <w:t>ValidationStrategy strategy;</w:t>
-      </w:r>
-    </w:p>
-    <w:p/>
-    <w:p>
-      <w:r>
-        <w:t>RestPeriodValidationStrategy</w:t>
-      </w:r>
-    </w:p>
-    <w:p>
-      <w:r>
-        <w:lastRenderedPageBreak/>
-        <w:t>FlightHoursValidationStrategy</w:t>
-      </w:r>
-    </w:p>
-    <w:p>
-      <w:r>
-        <w:t>QualificationValidationStrategy</w:t>
-      </w:r>
-    </w:p>
-    <w:p>
-      <w:r>
-        <w:t>MedicalValidationStrategy</w:t>
-      </w:r>
-    </w:p>
-    <w:p/>
-    <w:p>
-      <w:r>
-        <w:t>strategy.validate(request);</w:t>
       </w:r>
     </w:p>
     <w:p/>
     <w:p/>
+    <w:p/>
     <w:p>
       <w:pPr>
         <w:pStyle w:val="Heading2"/>
@@ -12229,95 +14181,23 @@
     </w:p>
     <w:p>
       <w:r>
-        <w:t>Used the Observer pattern through Kafka event-driven architecture, where ScheduleCreated and ScheduleUpdated events notified multiple independent consumers such as Projector, Notification, and Audit services.</w:t>
-      </w:r>
-    </w:p>
-    <w:p>
-      <w:pPr>
-        <w:pStyle w:val="Heading2"/>
-      </w:pPr>
-      <w:r>
-        <w:t>Factory Patter</w:t>
-      </w:r>
-      <w:r>
-        <w:t>n</w:t>
-      </w:r>
-    </w:p>
-    <w:p>
-      <w:r>
-        <w:t xml:space="preserve">Used in </w:t>
-      </w:r>
-      <w:r>
-        <w:t>Validation Rule Factory</w:t>
-      </w:r>
-    </w:p>
-    <w:p/>
-    <w:p>
-      <w:r>
-        <w:t>ValidationRule rule =validationRuleFactory.getRule(validationType);</w:t>
-      </w:r>
-    </w:p>
-    <w:p/>
-    <w:p>
-      <w:r>
-        <w:t xml:space="preserve">REST_PERIOD </w:t>
-      </w:r>
-      <w:r>
-        <w:rPr>
-          <w:rFonts w:ascii="Times New Roman" w:hAnsi="Times New Roman" w:cs="Times New Roman"/>
-        </w:rPr>
-        <w:t>→</w:t>
-      </w:r>
-      <w:r>
-        <w:t xml:space="preserve"> RestPeriodValidationRule</w:t>
-      </w:r>
-    </w:p>
-    <w:p>
-      <w:r>
-        <w:t xml:space="preserve">FLIGHT_HOURS </w:t>
-      </w:r>
-      <w:r>
-        <w:rPr>
-          <w:rFonts w:ascii="Times New Roman" w:hAnsi="Times New Roman" w:cs="Times New Roman"/>
-        </w:rPr>
-        <w:t>→</w:t>
-      </w:r>
-      <w:r>
-        <w:t xml:space="preserve"> FlightHoursValidationRule</w:t>
-      </w:r>
-    </w:p>
-    <w:p>
-      <w:r>
-        <w:t xml:space="preserve">MEDICAL </w:t>
-      </w:r>
-      <w:r>
-        <w:rPr>
-          <w:rFonts w:ascii="Times New Roman" w:hAnsi="Times New Roman" w:cs="Times New Roman"/>
-        </w:rPr>
-        <w:t>→</w:t>
-      </w:r>
-      <w:r>
-        <w:t xml:space="preserve"> MedicalValidationRule</w:t>
-      </w:r>
-    </w:p>
-    <w:p>
-      <w:r>
-        <w:t xml:space="preserve">QUALIFICATION </w:t>
-      </w:r>
-      <w:r>
-        <w:rPr>
-          <w:rFonts w:ascii="Times New Roman" w:hAnsi="Times New Roman" w:cs="Times New Roman"/>
-        </w:rPr>
-        <w:t>→</w:t>
-      </w:r>
-      <w:r>
-        <w:t xml:space="preserve"> QualificationValidationRule</w:t>
-      </w:r>
-    </w:p>
-    <w:p/>
-    <w:p>
-      <w:r>
-        <w:t>Used a Factory pattern in the Crew Validation Service to create the appropriate validation rule implementation based on the validation type being processed.</w:t>
+        <w:t xml:space="preserve">Used the Observer pattern through Kafka event-driven architecture, where </w:t>
+      </w:r>
+      <w:proofErr w:type="spellStart"/>
+      <w:r>
+        <w:t>ScheduleCreated</w:t>
+      </w:r>
+      <w:proofErr w:type="spellEnd"/>
+      <w:r>
+        <w:t xml:space="preserve"> and </w:t>
+      </w:r>
+      <w:proofErr w:type="spellStart"/>
+      <w:r>
+        <w:t>ScheduleUpdated</w:t>
+      </w:r>
+      <w:proofErr w:type="spellEnd"/>
+      <w:r>
+        <w:t xml:space="preserve"> events notified multiple independent consumers such as Projector, Notification, and Audit services.</w:t>
       </w:r>
     </w:p>
     <w:p/>
@@ -19824,7 +21704,6 @@
   <w:style w:type="character" w:default="1" w:styleId="DefaultParagraphFont">
     <w:name w:val="Default Paragraph Font"/>
     <w:uiPriority w:val="1"/>
-    <w:semiHidden/>
     <w:unhideWhenUsed/>
   </w:style>
   <w:style w:type="table" w:default="1" w:styleId="TableNormal">

</xml_diff>